<commit_message>
Updated Requirement and Design Document.docx
</commit_message>
<xml_diff>
--- a/Requirement and Design Document.docx
+++ b/Requirement and Design Document.docx
@@ -4,68 +4,578 @@
   <w:body>
     <w:p>
       <w:pPr>
-        <w:rPr>
+        <w:jc w:val="center"/>
+        <w:rPr>
+          <w:rFonts w:cstheme="minorHAnsi"/>
+          <w:b/>
+          <w:bCs/>
+          <w:sz w:val="40"/>
+          <w:szCs w:val="40"/>
+        </w:rPr>
+      </w:pPr>
+      <w:r>
+        <w:rPr>
+          <w:rFonts w:cstheme="minorHAnsi"/>
+          <w:b/>
+          <w:bCs/>
+          <w:sz w:val="40"/>
+          <w:szCs w:val="40"/>
+        </w:rPr>
+        <w:t>Web Project Final Evaluation</w:t>
+      </w:r>
+    </w:p>
+    <w:p>
+      <w:pPr>
+        <w:jc w:val="center"/>
+        <w:rPr>
+          <w:rFonts w:cstheme="minorHAnsi"/>
+          <w:b/>
+          <w:bCs/>
+          <w:sz w:val="36"/>
+          <w:szCs w:val="36"/>
+        </w:rPr>
+      </w:pPr>
+    </w:p>
+    <w:p>
+      <w:pPr>
+        <w:jc w:val="center"/>
+        <w:rPr>
+          <w:rFonts w:cstheme="minorHAnsi"/>
+          <w:b/>
+          <w:bCs/>
+          <w:sz w:val="36"/>
+          <w:szCs w:val="36"/>
+        </w:rPr>
+      </w:pPr>
+    </w:p>
+    <w:p>
+      <w:pPr>
+        <w:jc w:val="center"/>
+        <w:rPr>
+          <w:rFonts w:cstheme="minorHAnsi"/>
+          <w:b/>
+          <w:bCs/>
+          <w:sz w:val="36"/>
+          <w:szCs w:val="36"/>
+        </w:rPr>
+      </w:pPr>
+    </w:p>
+    <w:p>
+      <w:pPr>
+        <w:jc w:val="center"/>
+        <w:rPr>
+          <w:rFonts w:cstheme="minorHAnsi"/>
+          <w:b/>
+          <w:bCs/>
+          <w:sz w:val="36"/>
+          <w:szCs w:val="36"/>
+        </w:rPr>
+      </w:pPr>
+    </w:p>
+    <w:p>
+      <w:pPr>
+        <w:jc w:val="center"/>
+        <w:rPr>
+          <w:rFonts w:cstheme="minorHAnsi"/>
+          <w:b/>
+          <w:bCs/>
+          <w:sz w:val="36"/>
+          <w:szCs w:val="36"/>
+        </w:rPr>
+      </w:pPr>
+    </w:p>
+    <w:p>
+      <w:pPr>
+        <w:jc w:val="center"/>
+        <w:rPr>
+          <w:rFonts w:cstheme="minorHAnsi"/>
+          <w:b/>
+          <w:bCs/>
+          <w:sz w:val="56"/>
+          <w:szCs w:val="56"/>
+        </w:rPr>
+      </w:pPr>
+      <w:proofErr w:type="spellStart"/>
+      <w:r>
+        <w:rPr>
+          <w:rFonts w:cstheme="minorHAnsi"/>
+          <w:b/>
+          <w:bCs/>
+          <w:sz w:val="56"/>
+          <w:szCs w:val="56"/>
+        </w:rPr>
+        <w:t>HerCircle</w:t>
+      </w:r>
+      <w:proofErr w:type="spellEnd"/>
+      <w:r>
+        <w:rPr>
+          <w:rFonts w:cstheme="minorHAnsi"/>
+          <w:b/>
+          <w:bCs/>
+          <w:sz w:val="56"/>
+          <w:szCs w:val="56"/>
+        </w:rPr>
+        <w:t xml:space="preserve"> - Requirement and </w:t>
+      </w:r>
+      <w:r>
+        <w:rPr>
+          <w:rFonts w:cstheme="minorHAnsi"/>
+          <w:b/>
+          <w:bCs/>
+          <w:sz w:val="56"/>
+          <w:szCs w:val="56"/>
+        </w:rPr>
+        <w:br/>
+        <w:t>Design Specificatio</w:t>
+      </w:r>
+      <w:r>
+        <w:rPr>
+          <w:rFonts w:cstheme="minorHAnsi"/>
+          <w:b/>
+          <w:bCs/>
+          <w:sz w:val="56"/>
+          <w:szCs w:val="56"/>
+        </w:rPr>
+        <w:t>n</w:t>
+      </w:r>
+    </w:p>
+    <w:p>
+      <w:pPr>
+        <w:jc w:val="center"/>
+        <w:rPr>
+          <w:rFonts w:cstheme="minorHAnsi"/>
+          <w:sz w:val="28"/>
+          <w:szCs w:val="28"/>
+        </w:rPr>
+      </w:pPr>
+      <w:r>
+        <w:rPr>
+          <w:rFonts w:cstheme="minorHAnsi"/>
+          <w:sz w:val="28"/>
+          <w:szCs w:val="28"/>
+        </w:rPr>
+        <w:t>Date: March 26, 2026</w:t>
+      </w:r>
+    </w:p>
+    <w:p>
+      <w:pPr>
+        <w:rPr>
+          <w:rFonts w:cstheme="minorHAnsi"/>
           <w:b/>
           <w:bCs/>
           <w:sz w:val="32"/>
           <w:szCs w:val="32"/>
-          <w:lang w:val="en-IN"/>
-        </w:rPr>
-      </w:pPr>
-      <w:proofErr w:type="spellStart"/>
-      <w:r>
-        <w:rPr>
+        </w:rPr>
+      </w:pPr>
+    </w:p>
+    <w:p>
+      <w:pPr>
+        <w:rPr>
+          <w:rFonts w:cstheme="minorHAnsi"/>
           <w:b/>
           <w:bCs/>
           <w:sz w:val="32"/>
           <w:szCs w:val="32"/>
-          <w:lang w:val="en-IN"/>
-        </w:rPr>
-        <w:t>HerCircle</w:t>
-      </w:r>
-      <w:proofErr w:type="spellEnd"/>
-      <w:r>
-        <w:rPr>
+        </w:rPr>
+      </w:pPr>
+    </w:p>
+    <w:p>
+      <w:pPr>
+        <w:rPr>
+          <w:rFonts w:cstheme="minorHAnsi"/>
           <w:b/>
           <w:bCs/>
           <w:sz w:val="32"/>
           <w:szCs w:val="32"/>
-          <w:lang w:val="en-IN"/>
-        </w:rPr>
-        <w:t xml:space="preserve"> - Requirement and Design Specification</w:t>
-      </w:r>
-    </w:p>
-    <w:p>
-      <w:pPr>
-        <w:rPr>
-          <w:lang w:val="en-IN"/>
-        </w:rPr>
-      </w:pPr>
-      <w:r>
-        <w:rPr>
-          <w:lang w:val="en-IN"/>
-        </w:rPr>
-        <w:t>Date: March 26, 2026</w:t>
-      </w:r>
-    </w:p>
-    <w:p>
-      <w:pPr>
-        <w:rPr>
-          <w:lang w:val="en-IN"/>
-        </w:rPr>
-      </w:pPr>
-      <w:r>
-        <w:rPr>
-          <w:lang w:val="en-IN"/>
-        </w:rPr>
-        <w:pict w14:anchorId="2D3A470D">
-          <v:rect id="_x0000_i1025" style="width:0;height:1.5pt" o:hralign="center" o:hrstd="t" o:hr="t" fillcolor="#a0a0a0" stroked="f"/>
-        </w:pict>
-      </w:r>
-    </w:p>
-    <w:p>
-      <w:pPr>
-        <w:rPr>
+        </w:rPr>
+      </w:pPr>
+    </w:p>
+    <w:p>
+      <w:pPr>
+        <w:rPr>
+          <w:rFonts w:cstheme="minorHAnsi"/>
+          <w:b/>
+          <w:bCs/>
+          <w:sz w:val="32"/>
+          <w:szCs w:val="32"/>
+        </w:rPr>
+      </w:pPr>
+    </w:p>
+    <w:p>
+      <w:pPr>
+        <w:rPr>
+          <w:rFonts w:cstheme="minorHAnsi"/>
+          <w:b/>
+          <w:bCs/>
+          <w:sz w:val="32"/>
+          <w:szCs w:val="32"/>
+        </w:rPr>
+      </w:pPr>
+    </w:p>
+    <w:p>
+      <w:pPr>
+        <w:rPr>
+          <w:rFonts w:cstheme="minorHAnsi"/>
+          <w:b/>
+          <w:bCs/>
+          <w:sz w:val="32"/>
+          <w:szCs w:val="32"/>
+        </w:rPr>
+      </w:pPr>
+    </w:p>
+    <w:p>
+      <w:pPr>
+        <w:rPr>
+          <w:rFonts w:cstheme="minorHAnsi"/>
+          <w:sz w:val="32"/>
+          <w:szCs w:val="32"/>
+        </w:rPr>
+      </w:pPr>
+      <w:r>
+        <w:rPr>
+          <w:rFonts w:cstheme="minorHAnsi"/>
+          <w:sz w:val="32"/>
+          <w:szCs w:val="32"/>
+        </w:rPr>
+        <w:t>Name: Jiya</w:t>
+      </w:r>
+      <w:r>
+        <w:rPr>
+          <w:rFonts w:cstheme="minorHAnsi"/>
+          <w:sz w:val="32"/>
+          <w:szCs w:val="32"/>
+        </w:rPr>
+        <w:tab/>
+      </w:r>
+      <w:r>
+        <w:rPr>
+          <w:rFonts w:cstheme="minorHAnsi"/>
+          <w:sz w:val="32"/>
+          <w:szCs w:val="32"/>
+        </w:rPr>
+        <w:tab/>
+      </w:r>
+      <w:r>
+        <w:rPr>
+          <w:rFonts w:cstheme="minorHAnsi"/>
+          <w:sz w:val="32"/>
+          <w:szCs w:val="32"/>
+        </w:rPr>
+        <w:tab/>
+      </w:r>
+      <w:r>
+        <w:rPr>
+          <w:rFonts w:cstheme="minorHAnsi"/>
+          <w:sz w:val="32"/>
+          <w:szCs w:val="32"/>
+        </w:rPr>
+        <w:tab/>
+      </w:r>
+      <w:r>
+        <w:rPr>
+          <w:rFonts w:cstheme="minorHAnsi"/>
+          <w:sz w:val="32"/>
+          <w:szCs w:val="32"/>
+        </w:rPr>
+        <w:tab/>
+      </w:r>
+      <w:r>
+        <w:rPr>
+          <w:rFonts w:cstheme="minorHAnsi"/>
+          <w:sz w:val="32"/>
+          <w:szCs w:val="32"/>
+        </w:rPr>
+        <w:tab/>
+      </w:r>
+      <w:r>
+        <w:rPr>
+          <w:rFonts w:cstheme="minorHAnsi"/>
+          <w:sz w:val="32"/>
+          <w:szCs w:val="32"/>
+        </w:rPr>
+        <w:t xml:space="preserve">              Submitted </w:t>
+      </w:r>
+      <w:r>
+        <w:rPr>
+          <w:rFonts w:cstheme="minorHAnsi"/>
+          <w:sz w:val="32"/>
+          <w:szCs w:val="32"/>
+        </w:rPr>
+        <w:t>To: Vaibhav Sir</w:t>
+      </w:r>
+    </w:p>
+    <w:p>
+      <w:pPr>
+        <w:rPr>
+          <w:rFonts w:cstheme="minorHAnsi"/>
+          <w:sz w:val="32"/>
+          <w:szCs w:val="32"/>
+        </w:rPr>
+      </w:pPr>
+      <w:r>
+        <w:rPr>
+          <w:rFonts w:cstheme="minorHAnsi"/>
+          <w:sz w:val="32"/>
+          <w:szCs w:val="32"/>
+        </w:rPr>
+        <w:t>Roll No.: 2310991693</w:t>
+      </w:r>
+    </w:p>
+    <w:p>
+      <w:pPr>
+        <w:rPr>
+          <w:rFonts w:cstheme="minorHAnsi"/>
+          <w:b/>
+          <w:bCs/>
+          <w:sz w:val="32"/>
+          <w:szCs w:val="32"/>
+        </w:rPr>
+      </w:pPr>
+      <w:r>
+        <w:rPr>
+          <w:rFonts w:cstheme="minorHAnsi"/>
+          <w:sz w:val="32"/>
+          <w:szCs w:val="32"/>
+        </w:rPr>
+        <w:t>Group: 16 (UCA)</w:t>
+      </w:r>
+      <w:r>
+        <w:rPr>
+          <w:rFonts w:cstheme="minorHAnsi"/>
+          <w:b/>
+          <w:bCs/>
+          <w:sz w:val="32"/>
+          <w:szCs w:val="32"/>
+        </w:rPr>
+        <w:br w:type="page"/>
+      </w:r>
+    </w:p>
+    <w:p>
+      <w:pPr>
+        <w:jc w:val="center"/>
+        <w:rPr>
+          <w:rFonts w:cstheme="minorHAnsi"/>
+          <w:b/>
+          <w:bCs/>
+          <w:sz w:val="40"/>
+          <w:szCs w:val="40"/>
+        </w:rPr>
+      </w:pPr>
+      <w:r>
+        <w:rPr>
+          <w:rFonts w:cstheme="minorHAnsi"/>
+          <w:b/>
+          <w:bCs/>
+          <w:sz w:val="40"/>
+          <w:szCs w:val="40"/>
+        </w:rPr>
+        <w:lastRenderedPageBreak/>
+        <w:t>Table of Contents</w:t>
+      </w:r>
+    </w:p>
+    <w:p>
+      <w:pPr>
+        <w:rPr>
+          <w:rFonts w:cstheme="minorHAnsi"/>
+          <w:sz w:val="32"/>
+          <w:szCs w:val="32"/>
+        </w:rPr>
+      </w:pPr>
+      <w:r>
+        <w:rPr>
+          <w:rFonts w:cstheme="minorHAnsi"/>
+          <w:sz w:val="32"/>
+          <w:szCs w:val="32"/>
+        </w:rPr>
+        <w:t>1. Introduction</w:t>
+      </w:r>
+    </w:p>
+    <w:p>
+      <w:pPr>
+        <w:rPr>
+          <w:rFonts w:cstheme="minorHAnsi"/>
+          <w:sz w:val="32"/>
+          <w:szCs w:val="32"/>
+        </w:rPr>
+      </w:pPr>
+      <w:r>
+        <w:rPr>
+          <w:rFonts w:cstheme="minorHAnsi"/>
+          <w:sz w:val="32"/>
+          <w:szCs w:val="32"/>
+        </w:rPr>
+        <w:t>2. Overall Description</w:t>
+      </w:r>
+    </w:p>
+    <w:p>
+      <w:pPr>
+        <w:rPr>
+          <w:rFonts w:cstheme="minorHAnsi"/>
+          <w:sz w:val="32"/>
+          <w:szCs w:val="32"/>
+        </w:rPr>
+      </w:pPr>
+      <w:r>
+        <w:rPr>
+          <w:rFonts w:cstheme="minorHAnsi"/>
+          <w:sz w:val="32"/>
+          <w:szCs w:val="32"/>
+        </w:rPr>
+        <w:t>3. Functional Requirements</w:t>
+      </w:r>
+    </w:p>
+    <w:p>
+      <w:pPr>
+        <w:rPr>
+          <w:rFonts w:cstheme="minorHAnsi"/>
+          <w:sz w:val="32"/>
+          <w:szCs w:val="32"/>
+        </w:rPr>
+      </w:pPr>
+      <w:r>
+        <w:rPr>
+          <w:rFonts w:cstheme="minorHAnsi"/>
+          <w:sz w:val="32"/>
+          <w:szCs w:val="32"/>
+        </w:rPr>
+        <w:t>4. Non-Functional Requirements</w:t>
+      </w:r>
+    </w:p>
+    <w:p>
+      <w:pPr>
+        <w:rPr>
+          <w:rFonts w:cstheme="minorHAnsi"/>
+          <w:sz w:val="32"/>
+          <w:szCs w:val="32"/>
+        </w:rPr>
+      </w:pPr>
+      <w:r>
+        <w:rPr>
+          <w:rFonts w:cstheme="minorHAnsi"/>
+          <w:sz w:val="32"/>
+          <w:szCs w:val="32"/>
+        </w:rPr>
+        <w:t>5. System Architecture</w:t>
+      </w:r>
+    </w:p>
+    <w:p>
+      <w:pPr>
+        <w:rPr>
+          <w:rFonts w:cstheme="minorHAnsi"/>
+          <w:sz w:val="32"/>
+          <w:szCs w:val="32"/>
+        </w:rPr>
+      </w:pPr>
+      <w:r>
+        <w:rPr>
+          <w:rFonts w:cstheme="minorHAnsi"/>
+          <w:sz w:val="32"/>
+          <w:szCs w:val="32"/>
+        </w:rPr>
+        <w:t>6. Database Schema Design</w:t>
+      </w:r>
+    </w:p>
+    <w:p>
+      <w:pPr>
+        <w:rPr>
+          <w:rFonts w:cstheme="minorHAnsi"/>
+          <w:sz w:val="32"/>
+          <w:szCs w:val="32"/>
+        </w:rPr>
+      </w:pPr>
+      <w:r>
+        <w:rPr>
+          <w:rFonts w:cstheme="minorHAnsi"/>
+          <w:sz w:val="32"/>
+          <w:szCs w:val="32"/>
+        </w:rPr>
+        <w:t>7. UI/UX Design Specifications</w:t>
+      </w:r>
+    </w:p>
+    <w:p>
+      <w:pPr>
+        <w:rPr>
+          <w:rFonts w:cstheme="minorHAnsi"/>
+          <w:sz w:val="32"/>
+          <w:szCs w:val="32"/>
+        </w:rPr>
+      </w:pPr>
+      <w:r>
+        <w:rPr>
+          <w:rFonts w:cstheme="minorHAnsi"/>
+          <w:sz w:val="32"/>
+          <w:szCs w:val="32"/>
+        </w:rPr>
+        <w:t>8. Timeline &amp; Milestones</w:t>
+      </w:r>
+    </w:p>
+    <w:p>
+      <w:pPr>
+        <w:rPr>
+          <w:rFonts w:cstheme="minorHAnsi"/>
+          <w:sz w:val="32"/>
+          <w:szCs w:val="32"/>
+        </w:rPr>
+      </w:pPr>
+      <w:r>
+        <w:rPr>
+          <w:rFonts w:cstheme="minorHAnsi"/>
+          <w:sz w:val="32"/>
+          <w:szCs w:val="32"/>
+        </w:rPr>
+        <w:t>9. Future Scope</w:t>
+      </w:r>
+    </w:p>
+    <w:p>
+      <w:pPr>
+        <w:rPr>
+          <w:rFonts w:cstheme="minorHAnsi"/>
+          <w:sz w:val="32"/>
+          <w:szCs w:val="32"/>
+        </w:rPr>
+      </w:pPr>
+      <w:r>
+        <w:rPr>
+          <w:rFonts w:cstheme="minorHAnsi"/>
+          <w:sz w:val="32"/>
+          <w:szCs w:val="32"/>
+        </w:rPr>
+        <w:t xml:space="preserve">10. </w:t>
+      </w:r>
+      <w:r>
+        <w:rPr>
+          <w:rFonts w:cstheme="minorHAnsi"/>
+          <w:sz w:val="32"/>
+          <w:szCs w:val="32"/>
+        </w:rPr>
+        <w:t>Conclusion</w:t>
+      </w:r>
+    </w:p>
+    <w:p>
+      <w:pPr>
+        <w:rPr>
+          <w:rFonts w:cstheme="minorHAnsi"/>
+          <w:b/>
+          <w:bCs/>
+          <w:sz w:val="32"/>
+          <w:szCs w:val="32"/>
+        </w:rPr>
+      </w:pPr>
+      <w:r>
+        <w:rPr>
+          <w:rFonts w:cstheme="minorHAnsi"/>
+          <w:b/>
+          <w:bCs/>
+          <w:sz w:val="32"/>
+          <w:szCs w:val="32"/>
+        </w:rPr>
+        <w:br w:type="page"/>
+      </w:r>
+    </w:p>
+    <w:p>
+      <w:pPr>
+        <w:rPr>
+          <w:rFonts w:cstheme="minorHAnsi"/>
           <w:b/>
           <w:bCs/>
           <w:sz w:val="28"/>
@@ -75,18 +585,21 @@
       </w:pPr>
       <w:r>
         <w:rPr>
+          <w:rFonts w:cstheme="minorHAnsi"/>
           <w:b/>
           <w:bCs/>
           <w:sz w:val="28"/>
           <w:szCs w:val="28"/>
           <w:lang w:val="en-IN"/>
         </w:rPr>
+        <w:lastRenderedPageBreak/>
         <w:t>1. Introduction</w:t>
       </w:r>
     </w:p>
     <w:p>
       <w:pPr>
         <w:rPr>
+          <w:rFonts w:cstheme="minorHAnsi"/>
           <w:b/>
           <w:bCs/>
           <w:sz w:val="24"/>
@@ -96,6 +609,7 @@
       </w:pPr>
       <w:r>
         <w:rPr>
+          <w:rFonts w:cstheme="minorHAnsi"/>
           <w:b/>
           <w:bCs/>
           <w:sz w:val="24"/>
@@ -109,12 +623,14 @@
       <w:pPr>
         <w:jc w:val="both"/>
         <w:rPr>
+          <w:rFonts w:cstheme="minorHAnsi"/>
           <w:lang w:val="en-IN"/>
         </w:rPr>
       </w:pPr>
       <w:proofErr w:type="spellStart"/>
       <w:r>
         <w:rPr>
+          <w:rFonts w:cstheme="minorHAnsi"/>
           <w:lang w:val="en-IN"/>
         </w:rPr>
         <w:t>HerCircle</w:t>
@@ -122,6 +638,7 @@
       <w:proofErr w:type="spellEnd"/>
       <w:r>
         <w:rPr>
+          <w:rFonts w:cstheme="minorHAnsi"/>
           <w:lang w:val="en-IN"/>
         </w:rPr>
         <w:t xml:space="preserve"> is a secure, MERN-stack-based web application designed as a social support platform exclusively for women. It enables users to engage in discussions around health, wellness, and personal topics in a safe and stigma-free environment.</w:t>
@@ -131,11 +648,13 @@
       <w:pPr>
         <w:jc w:val="both"/>
         <w:rPr>
-          <w:lang w:val="en-IN"/>
-        </w:rPr>
-      </w:pPr>
-      <w:r>
-        <w:rPr>
+          <w:rFonts w:cstheme="minorHAnsi"/>
+          <w:lang w:val="en-IN"/>
+        </w:rPr>
+      </w:pPr>
+      <w:r>
+        <w:rPr>
+          <w:rFonts w:cstheme="minorHAnsi"/>
           <w:lang w:val="en-IN"/>
         </w:rPr>
         <w:pict w14:anchorId="4DA62DC0">
@@ -146,6 +665,7 @@
     <w:p>
       <w:pPr>
         <w:rPr>
+          <w:rFonts w:cstheme="minorHAnsi"/>
           <w:b/>
           <w:bCs/>
           <w:sz w:val="24"/>
@@ -155,6 +675,7 @@
       </w:pPr>
       <w:r>
         <w:rPr>
+          <w:rFonts w:cstheme="minorHAnsi"/>
           <w:b/>
           <w:bCs/>
           <w:sz w:val="24"/>
@@ -174,11 +695,13 @@
           <w:tab w:val="num" w:pos="720"/>
         </w:tabs>
         <w:rPr>
-          <w:lang w:val="en-IN"/>
-        </w:rPr>
-      </w:pPr>
-      <w:r>
-        <w:rPr>
+          <w:rFonts w:cstheme="minorHAnsi"/>
+          <w:lang w:val="en-IN"/>
+        </w:rPr>
+      </w:pPr>
+      <w:r>
+        <w:rPr>
+          <w:rFonts w:cstheme="minorHAnsi"/>
           <w:lang w:val="en-IN"/>
         </w:rPr>
         <w:t xml:space="preserve">Provide a safe and supportive space for women </w:t>
@@ -194,11 +717,13 @@
           <w:tab w:val="num" w:pos="720"/>
         </w:tabs>
         <w:rPr>
-          <w:lang w:val="en-IN"/>
-        </w:rPr>
-      </w:pPr>
-      <w:r>
-        <w:rPr>
+          <w:rFonts w:cstheme="minorHAnsi"/>
+          <w:lang w:val="en-IN"/>
+        </w:rPr>
+      </w:pPr>
+      <w:r>
+        <w:rPr>
+          <w:rFonts w:cstheme="minorHAnsi"/>
           <w:lang w:val="en-IN"/>
         </w:rPr>
         <w:t xml:space="preserve">Enable anonymous sharing for sensitive topics </w:t>
@@ -214,11 +739,13 @@
           <w:tab w:val="num" w:pos="720"/>
         </w:tabs>
         <w:rPr>
-          <w:lang w:val="en-IN"/>
-        </w:rPr>
-      </w:pPr>
-      <w:r>
-        <w:rPr>
+          <w:rFonts w:cstheme="minorHAnsi"/>
+          <w:lang w:val="en-IN"/>
+        </w:rPr>
+      </w:pPr>
+      <w:r>
+        <w:rPr>
+          <w:rFonts w:cstheme="minorHAnsi"/>
           <w:lang w:val="en-IN"/>
         </w:rPr>
         <w:t xml:space="preserve">Foster community interaction through posts and discussions </w:t>
@@ -234,11 +761,13 @@
           <w:tab w:val="num" w:pos="720"/>
         </w:tabs>
         <w:rPr>
-          <w:lang w:val="en-IN"/>
-        </w:rPr>
-      </w:pPr>
-      <w:r>
-        <w:rPr>
+          <w:rFonts w:cstheme="minorHAnsi"/>
+          <w:lang w:val="en-IN"/>
+        </w:rPr>
+      </w:pPr>
+      <w:r>
+        <w:rPr>
+          <w:rFonts w:cstheme="minorHAnsi"/>
           <w:lang w:val="en-IN"/>
         </w:rPr>
         <w:t xml:space="preserve">Offer AI-powered guidance via an integrated chatbot </w:t>
@@ -247,21 +776,32 @@
     <w:p>
       <w:pPr>
         <w:rPr>
-          <w:lang w:val="en-IN"/>
-        </w:rPr>
-      </w:pPr>
-      <w:r>
-        <w:rPr>
+          <w:rFonts w:cstheme="minorHAnsi"/>
+          <w:lang w:val="en-IN"/>
+        </w:rPr>
+      </w:pPr>
+      <w:r>
+        <w:rPr>
+          <w:rFonts w:cstheme="minorHAnsi"/>
           <w:lang w:val="en-IN"/>
         </w:rPr>
         <w:pict w14:anchorId="2FC49B62">
-          <v:rect id="_x0000_i1027" style="width:0;height:1.5pt" o:hralign="center" o:hrstd="t" o:hr="t" fillcolor="#a0a0a0" stroked="f"/>
+          <v:rect id="_x0000_i1069" style="width:0;height:1.5pt" o:hralign="center" o:bullet="t" o:hrstd="t" o:hr="t" fillcolor="#a0a0a0" stroked="f"/>
         </w:pict>
       </w:r>
     </w:p>
     <w:p>
       <w:pPr>
         <w:rPr>
+          <w:rFonts w:cstheme="minorHAnsi"/>
+          <w:lang w:val="en-IN"/>
+        </w:rPr>
+      </w:pPr>
+    </w:p>
+    <w:p>
+      <w:pPr>
+        <w:rPr>
+          <w:rFonts w:cstheme="minorHAnsi"/>
           <w:b/>
           <w:bCs/>
           <w:sz w:val="28"/>
@@ -271,6 +811,7 @@
       </w:pPr>
       <w:r>
         <w:rPr>
+          <w:rFonts w:cstheme="minorHAnsi"/>
           <w:b/>
           <w:bCs/>
           <w:sz w:val="28"/>
@@ -283,6 +824,7 @@
     <w:p>
       <w:pPr>
         <w:rPr>
+          <w:rFonts w:cstheme="minorHAnsi"/>
           <w:b/>
           <w:bCs/>
           <w:sz w:val="24"/>
@@ -292,6 +834,7 @@
       </w:pPr>
       <w:r>
         <w:rPr>
+          <w:rFonts w:cstheme="minorHAnsi"/>
           <w:b/>
           <w:bCs/>
           <w:sz w:val="24"/>
@@ -305,11 +848,13 @@
       <w:pPr>
         <w:jc w:val="both"/>
         <w:rPr>
-          <w:lang w:val="en-IN"/>
-        </w:rPr>
-      </w:pPr>
-      <w:r>
-        <w:rPr>
+          <w:rFonts w:cstheme="minorHAnsi"/>
+          <w:lang w:val="en-IN"/>
+        </w:rPr>
+      </w:pPr>
+      <w:r>
+        <w:rPr>
+          <w:rFonts w:cstheme="minorHAnsi"/>
           <w:lang w:val="en-IN"/>
         </w:rPr>
         <w:t>The target audience consists of women seeking support, guidance, or community discussions. This includes users looking for peer advice as well as those seeking private AI-based assistance. No technical expertise is required to use the platform.</w:t>
@@ -318,11 +863,13 @@
     <w:p>
       <w:pPr>
         <w:rPr>
-          <w:lang w:val="en-IN"/>
-        </w:rPr>
-      </w:pPr>
-      <w:r>
-        <w:rPr>
+          <w:rFonts w:cstheme="minorHAnsi"/>
+          <w:lang w:val="en-IN"/>
+        </w:rPr>
+      </w:pPr>
+      <w:r>
+        <w:rPr>
+          <w:rFonts w:cstheme="minorHAnsi"/>
           <w:lang w:val="en-IN"/>
         </w:rPr>
         <w:pict w14:anchorId="2489DA64">
@@ -333,6 +880,7 @@
     <w:p>
       <w:pPr>
         <w:rPr>
+          <w:rFonts w:cstheme="minorHAnsi"/>
           <w:b/>
           <w:bCs/>
           <w:sz w:val="24"/>
@@ -342,6 +890,7 @@
       </w:pPr>
       <w:r>
         <w:rPr>
+          <w:rFonts w:cstheme="minorHAnsi"/>
           <w:b/>
           <w:bCs/>
           <w:sz w:val="24"/>
@@ -351,105 +900,247 @@
         <w:t>2.2 Operating Environment</w:t>
       </w:r>
     </w:p>
-    <w:p>
-      <w:pPr>
-        <w:rPr>
-          <w:lang w:val="en-IN"/>
-        </w:rPr>
-      </w:pPr>
-      <w:r>
-        <w:rPr>
-          <w:b/>
-          <w:bCs/>
-          <w:lang w:val="en-IN"/>
-        </w:rPr>
-        <w:t>Frontend:</w:t>
-      </w:r>
-      <w:r>
-        <w:rPr>
-          <w:lang w:val="en-IN"/>
-        </w:rPr>
-        <w:t xml:space="preserve"> React.js, Tailwind CSS</w:t>
-      </w:r>
-      <w:r>
-        <w:rPr>
-          <w:lang w:val="en-IN"/>
-        </w:rPr>
-        <w:br/>
-      </w:r>
-      <w:r>
-        <w:rPr>
-          <w:b/>
-          <w:bCs/>
-          <w:lang w:val="en-IN"/>
-        </w:rPr>
-        <w:t>Backend:</w:t>
-      </w:r>
-      <w:r>
-        <w:rPr>
-          <w:lang w:val="en-IN"/>
-        </w:rPr>
-        <w:t xml:space="preserve"> Node.js, Express.js</w:t>
-      </w:r>
-      <w:r>
-        <w:rPr>
-          <w:lang w:val="en-IN"/>
-        </w:rPr>
-        <w:br/>
-      </w:r>
-      <w:r>
-        <w:rPr>
-          <w:b/>
-          <w:bCs/>
-          <w:lang w:val="en-IN"/>
-        </w:rPr>
-        <w:t>Database:</w:t>
-      </w:r>
-      <w:r>
-        <w:rPr>
-          <w:lang w:val="en-IN"/>
-        </w:rPr>
-        <w:t xml:space="preserve"> MongoDB</w:t>
-      </w:r>
-      <w:r>
-        <w:rPr>
-          <w:lang w:val="en-IN"/>
-        </w:rPr>
-        <w:br/>
-      </w:r>
-      <w:r>
-        <w:rPr>
-          <w:b/>
-          <w:bCs/>
-          <w:lang w:val="en-IN"/>
-        </w:rPr>
-        <w:t>External API:</w:t>
-      </w:r>
-      <w:r>
-        <w:rPr>
-          <w:lang w:val="en-IN"/>
-        </w:rPr>
-        <w:t xml:space="preserve"> Google Gemini API</w:t>
-      </w:r>
-    </w:p>
-    <w:p>
-      <w:pPr>
-        <w:rPr>
-          <w:lang w:val="en-IN"/>
-        </w:rPr>
-      </w:pPr>
-      <w:r>
-        <w:rPr>
-          <w:lang w:val="en-IN"/>
-        </w:rPr>
-        <w:pict w14:anchorId="578BF55C">
-          <v:rect id="_x0000_i1029" style="width:0;height:1.5pt" o:hralign="center" o:hrstd="t" o:hr="t" fillcolor="#a0a0a0" stroked="f"/>
-        </w:pict>
-      </w:r>
-    </w:p>
-    <w:p>
-      <w:pPr>
-        <w:rPr>
+    <w:tbl>
+      <w:tblPr>
+        <w:tblStyle w:val="TableGrid"/>
+        <w:tblW w:w="8932" w:type="dxa"/>
+        <w:tblInd w:w="360" w:type="dxa"/>
+        <w:tblLook w:val="04A0" w:firstRow="1" w:lastRow="0" w:firstColumn="1" w:lastColumn="0" w:noHBand="0" w:noVBand="1"/>
+      </w:tblPr>
+      <w:tblGrid>
+        <w:gridCol w:w="4466"/>
+        <w:gridCol w:w="4466"/>
+      </w:tblGrid>
+      <w:tr>
+        <w:trPr>
+          <w:trHeight w:val="452"/>
+        </w:trPr>
+        <w:tc>
+          <w:tcPr>
+            <w:tcW w:w="4466" w:type="dxa"/>
+          </w:tcPr>
+          <w:p>
+            <w:pPr>
+              <w:rPr>
+                <w:rFonts w:cstheme="minorHAnsi"/>
+                <w:b/>
+                <w:bCs/>
+              </w:rPr>
+            </w:pPr>
+            <w:r>
+              <w:rPr>
+                <w:rFonts w:cstheme="minorHAnsi"/>
+                <w:b/>
+                <w:bCs/>
+              </w:rPr>
+              <w:t>Component</w:t>
+            </w:r>
+          </w:p>
+        </w:tc>
+        <w:tc>
+          <w:tcPr>
+            <w:tcW w:w="4466" w:type="dxa"/>
+          </w:tcPr>
+          <w:p>
+            <w:pPr>
+              <w:rPr>
+                <w:rFonts w:cstheme="minorHAnsi"/>
+                <w:b/>
+                <w:bCs/>
+              </w:rPr>
+            </w:pPr>
+            <w:r>
+              <w:rPr>
+                <w:rFonts w:cstheme="minorHAnsi"/>
+                <w:b/>
+                <w:bCs/>
+              </w:rPr>
+              <w:t>Technologies / Stack</w:t>
+            </w:r>
+          </w:p>
+        </w:tc>
+      </w:tr>
+      <w:tr>
+        <w:trPr>
+          <w:trHeight w:val="452"/>
+        </w:trPr>
+        <w:tc>
+          <w:tcPr>
+            <w:tcW w:w="4466" w:type="dxa"/>
+          </w:tcPr>
+          <w:p>
+            <w:pPr>
+              <w:rPr>
+                <w:rFonts w:cstheme="minorHAnsi"/>
+              </w:rPr>
+            </w:pPr>
+            <w:r>
+              <w:rPr>
+                <w:rFonts w:cstheme="minorHAnsi"/>
+              </w:rPr>
+              <w:t>Frontend</w:t>
+            </w:r>
+          </w:p>
+        </w:tc>
+        <w:tc>
+          <w:tcPr>
+            <w:tcW w:w="4466" w:type="dxa"/>
+          </w:tcPr>
+          <w:p>
+            <w:pPr>
+              <w:rPr>
+                <w:rFonts w:cstheme="minorHAnsi"/>
+              </w:rPr>
+            </w:pPr>
+            <w:r>
+              <w:rPr>
+                <w:rFonts w:cstheme="minorHAnsi"/>
+              </w:rPr>
+              <w:t>React.js</w:t>
+            </w:r>
+          </w:p>
+        </w:tc>
+      </w:tr>
+      <w:tr>
+        <w:trPr>
+          <w:trHeight w:val="452"/>
+        </w:trPr>
+        <w:tc>
+          <w:tcPr>
+            <w:tcW w:w="4466" w:type="dxa"/>
+          </w:tcPr>
+          <w:p>
+            <w:pPr>
+              <w:rPr>
+                <w:rFonts w:cstheme="minorHAnsi"/>
+              </w:rPr>
+            </w:pPr>
+            <w:r>
+              <w:rPr>
+                <w:rFonts w:cstheme="minorHAnsi"/>
+              </w:rPr>
+              <w:t>Backend</w:t>
+            </w:r>
+          </w:p>
+        </w:tc>
+        <w:tc>
+          <w:tcPr>
+            <w:tcW w:w="4466" w:type="dxa"/>
+          </w:tcPr>
+          <w:p>
+            <w:pPr>
+              <w:rPr>
+                <w:rFonts w:cstheme="minorHAnsi"/>
+              </w:rPr>
+            </w:pPr>
+            <w:r>
+              <w:rPr>
+                <w:rFonts w:cstheme="minorHAnsi"/>
+              </w:rPr>
+              <w:t>Node.js, Express.js</w:t>
+            </w:r>
+          </w:p>
+        </w:tc>
+      </w:tr>
+      <w:tr>
+        <w:trPr>
+          <w:trHeight w:val="452"/>
+        </w:trPr>
+        <w:tc>
+          <w:tcPr>
+            <w:tcW w:w="4466" w:type="dxa"/>
+          </w:tcPr>
+          <w:p>
+            <w:pPr>
+              <w:rPr>
+                <w:rFonts w:cstheme="minorHAnsi"/>
+              </w:rPr>
+            </w:pPr>
+            <w:r>
+              <w:rPr>
+                <w:rFonts w:cstheme="minorHAnsi"/>
+              </w:rPr>
+              <w:t>Database</w:t>
+            </w:r>
+          </w:p>
+        </w:tc>
+        <w:tc>
+          <w:tcPr>
+            <w:tcW w:w="4466" w:type="dxa"/>
+          </w:tcPr>
+          <w:p>
+            <w:pPr>
+              <w:rPr>
+                <w:rFonts w:cstheme="minorHAnsi"/>
+              </w:rPr>
+            </w:pPr>
+            <w:r>
+              <w:rPr>
+                <w:rFonts w:cstheme="minorHAnsi"/>
+              </w:rPr>
+              <w:t>MongoDB</w:t>
+            </w:r>
+          </w:p>
+        </w:tc>
+      </w:tr>
+      <w:tr>
+        <w:trPr>
+          <w:trHeight w:val="417"/>
+        </w:trPr>
+        <w:tc>
+          <w:tcPr>
+            <w:tcW w:w="4466" w:type="dxa"/>
+          </w:tcPr>
+          <w:p>
+            <w:pPr>
+              <w:rPr>
+                <w:rFonts w:cstheme="minorHAnsi"/>
+              </w:rPr>
+            </w:pPr>
+            <w:r>
+              <w:rPr>
+                <w:rFonts w:cstheme="minorHAnsi"/>
+              </w:rPr>
+              <w:t>External API</w:t>
+            </w:r>
+          </w:p>
+        </w:tc>
+        <w:tc>
+          <w:tcPr>
+            <w:tcW w:w="4466" w:type="dxa"/>
+          </w:tcPr>
+          <w:p>
+            <w:pPr>
+              <w:rPr>
+                <w:rFonts w:cstheme="minorHAnsi"/>
+              </w:rPr>
+            </w:pPr>
+            <w:r>
+              <w:rPr>
+                <w:rFonts w:cstheme="minorHAnsi"/>
+              </w:rPr>
+              <w:t>Google Gemini API</w:t>
+            </w:r>
+          </w:p>
+        </w:tc>
+      </w:tr>
+    </w:tbl>
+    <w:p>
+      <w:pPr>
+        <w:rPr>
+          <w:rFonts w:cstheme="minorHAnsi"/>
+          <w:b/>
+          <w:bCs/>
+          <w:sz w:val="24"/>
+          <w:szCs w:val="24"/>
+          <w:lang w:val="en-IN"/>
+        </w:rPr>
+      </w:pPr>
+    </w:p>
+    <w:p>
+      <w:pPr>
+        <w:rPr>
+          <w:rFonts w:cstheme="minorHAnsi"/>
           <w:b/>
           <w:bCs/>
           <w:sz w:val="28"/>
@@ -457,14 +1148,27 @@
           <w:lang w:val="en-IN"/>
         </w:rPr>
       </w:pPr>
-      <w:r>
-        <w:rPr>
+    </w:p>
+    <w:p>
+      <w:pPr>
+        <w:rPr>
+          <w:rFonts w:cstheme="minorHAnsi"/>
           <w:b/>
           <w:bCs/>
           <w:sz w:val="28"/>
           <w:szCs w:val="28"/>
           <w:lang w:val="en-IN"/>
         </w:rPr>
+      </w:pPr>
+      <w:r>
+        <w:rPr>
+          <w:rFonts w:cstheme="minorHAnsi"/>
+          <w:b/>
+          <w:bCs/>
+          <w:sz w:val="28"/>
+          <w:szCs w:val="28"/>
+          <w:lang w:val="en-IN"/>
+        </w:rPr>
         <w:lastRenderedPageBreak/>
         <w:t>3. Functional Requirements</w:t>
       </w:r>
@@ -472,6 +1176,7 @@
     <w:p>
       <w:pPr>
         <w:rPr>
+          <w:rFonts w:cstheme="minorHAnsi"/>
           <w:b/>
           <w:bCs/>
           <w:sz w:val="24"/>
@@ -481,6 +1186,7 @@
       </w:pPr>
       <w:r>
         <w:rPr>
+          <w:rFonts w:cstheme="minorHAnsi"/>
           <w:b/>
           <w:bCs/>
           <w:sz w:val="24"/>
@@ -498,11 +1204,13 @@
           <w:numId w:val="5"/>
         </w:numPr>
         <w:rPr>
-          <w:lang w:val="en-IN"/>
-        </w:rPr>
-      </w:pPr>
-      <w:r>
-        <w:rPr>
+          <w:rFonts w:cstheme="minorHAnsi"/>
+          <w:lang w:val="en-IN"/>
+        </w:rPr>
+      </w:pPr>
+      <w:r>
+        <w:rPr>
+          <w:rFonts w:cstheme="minorHAnsi"/>
           <w:lang w:val="en-IN"/>
         </w:rPr>
         <w:t>Users must be able to sign up using email and password</w:t>
@@ -516,11 +1224,13 @@
           <w:numId w:val="5"/>
         </w:numPr>
         <w:rPr>
-          <w:lang w:val="en-IN"/>
-        </w:rPr>
-      </w:pPr>
-      <w:r>
-        <w:rPr>
+          <w:rFonts w:cstheme="minorHAnsi"/>
+          <w:lang w:val="en-IN"/>
+        </w:rPr>
+      </w:pPr>
+      <w:r>
+        <w:rPr>
+          <w:rFonts w:cstheme="minorHAnsi"/>
           <w:lang w:val="en-IN"/>
         </w:rPr>
         <w:t>Users must be able to log in and receive a JWT token</w:t>
@@ -534,11 +1244,13 @@
           <w:numId w:val="5"/>
         </w:numPr>
         <w:rPr>
-          <w:lang w:val="en-IN"/>
-        </w:rPr>
-      </w:pPr>
-      <w:r>
-        <w:rPr>
+          <w:rFonts w:cstheme="minorHAnsi"/>
+          <w:lang w:val="en-IN"/>
+        </w:rPr>
+      </w:pPr>
+      <w:r>
+        <w:rPr>
+          <w:rFonts w:cstheme="minorHAnsi"/>
           <w:lang w:val="en-IN"/>
         </w:rPr>
         <w:t>Protected routes must require valid authentication</w:t>
@@ -547,11 +1259,13 @@
     <w:p>
       <w:pPr>
         <w:rPr>
-          <w:lang w:val="en-IN"/>
-        </w:rPr>
-      </w:pPr>
-      <w:r>
-        <w:rPr>
+          <w:rFonts w:cstheme="minorHAnsi"/>
+          <w:lang w:val="en-IN"/>
+        </w:rPr>
+      </w:pPr>
+      <w:r>
+        <w:rPr>
+          <w:rFonts w:cstheme="minorHAnsi"/>
           <w:lang w:val="en-IN"/>
         </w:rPr>
         <w:pict w14:anchorId="2F50ABC1">
@@ -562,6 +1276,7 @@
     <w:p>
       <w:pPr>
         <w:rPr>
+          <w:rFonts w:cstheme="minorHAnsi"/>
           <w:b/>
           <w:bCs/>
           <w:sz w:val="24"/>
@@ -571,6 +1286,7 @@
       </w:pPr>
       <w:r>
         <w:rPr>
+          <w:rFonts w:cstheme="minorHAnsi"/>
           <w:b/>
           <w:bCs/>
           <w:sz w:val="24"/>
@@ -588,11 +1304,13 @@
           <w:numId w:val="6"/>
         </w:numPr>
         <w:rPr>
-          <w:lang w:val="en-IN"/>
-        </w:rPr>
-      </w:pPr>
-      <w:r>
-        <w:rPr>
+          <w:rFonts w:cstheme="minorHAnsi"/>
+          <w:lang w:val="en-IN"/>
+        </w:rPr>
+      </w:pPr>
+      <w:r>
+        <w:rPr>
+          <w:rFonts w:cstheme="minorHAnsi"/>
           <w:lang w:val="en-IN"/>
         </w:rPr>
         <w:t>Users can create text-based posts</w:t>
@@ -606,11 +1324,13 @@
           <w:numId w:val="6"/>
         </w:numPr>
         <w:rPr>
-          <w:lang w:val="en-IN"/>
-        </w:rPr>
-      </w:pPr>
-      <w:r>
-        <w:rPr>
+          <w:rFonts w:cstheme="minorHAnsi"/>
+          <w:lang w:val="en-IN"/>
+        </w:rPr>
+      </w:pPr>
+      <w:r>
+        <w:rPr>
+          <w:rFonts w:cstheme="minorHAnsi"/>
           <w:lang w:val="en-IN"/>
         </w:rPr>
         <w:t>Users can post anonymously</w:t>
@@ -624,11 +1344,13 @@
           <w:numId w:val="6"/>
         </w:numPr>
         <w:rPr>
-          <w:lang w:val="en-IN"/>
-        </w:rPr>
-      </w:pPr>
-      <w:r>
-        <w:rPr>
+          <w:rFonts w:cstheme="minorHAnsi"/>
+          <w:lang w:val="en-IN"/>
+        </w:rPr>
+      </w:pPr>
+      <w:r>
+        <w:rPr>
+          <w:rFonts w:cstheme="minorHAnsi"/>
           <w:lang w:val="en-IN"/>
         </w:rPr>
         <w:t>Posts can be categorized by topics such as PCOS, Cancer, Menstrual Health, Mental Health, Nutrition, Fitness, and Self-</w:t>
@@ -636,6 +1358,7 @@
       <w:proofErr w:type="spellStart"/>
       <w:r>
         <w:rPr>
+          <w:rFonts w:cstheme="minorHAnsi"/>
           <w:lang w:val="en-IN"/>
         </w:rPr>
         <w:t>Defense</w:t>
@@ -650,11 +1373,13 @@
           <w:numId w:val="6"/>
         </w:numPr>
         <w:rPr>
-          <w:lang w:val="en-IN"/>
-        </w:rPr>
-      </w:pPr>
-      <w:r>
-        <w:rPr>
+          <w:rFonts w:cstheme="minorHAnsi"/>
+          <w:lang w:val="en-IN"/>
+        </w:rPr>
+      </w:pPr>
+      <w:r>
+        <w:rPr>
+          <w:rFonts w:cstheme="minorHAnsi"/>
           <w:lang w:val="en-IN"/>
         </w:rPr>
         <w:t>Users can view a chronological feed of posts</w:t>
@@ -668,11 +1393,13 @@
           <w:numId w:val="6"/>
         </w:numPr>
         <w:rPr>
-          <w:lang w:val="en-IN"/>
-        </w:rPr>
-      </w:pPr>
-      <w:r>
-        <w:rPr>
+          <w:rFonts w:cstheme="minorHAnsi"/>
+          <w:lang w:val="en-IN"/>
+        </w:rPr>
+      </w:pPr>
+      <w:r>
+        <w:rPr>
+          <w:rFonts w:cstheme="minorHAnsi"/>
           <w:lang w:val="en-IN"/>
         </w:rPr>
         <w:t>Users can filter posts based on selected topics</w:t>
@@ -681,11 +1408,13 @@
     <w:p>
       <w:pPr>
         <w:rPr>
-          <w:lang w:val="en-IN"/>
-        </w:rPr>
-      </w:pPr>
-      <w:r>
-        <w:rPr>
+          <w:rFonts w:cstheme="minorHAnsi"/>
+          <w:lang w:val="en-IN"/>
+        </w:rPr>
+      </w:pPr>
+      <w:r>
+        <w:rPr>
+          <w:rFonts w:cstheme="minorHAnsi"/>
           <w:lang w:val="en-IN"/>
         </w:rPr>
         <w:pict w14:anchorId="44D9E314">
@@ -696,6 +1425,7 @@
     <w:p>
       <w:pPr>
         <w:rPr>
+          <w:rFonts w:cstheme="minorHAnsi"/>
           <w:b/>
           <w:bCs/>
           <w:sz w:val="24"/>
@@ -705,6 +1435,7 @@
       </w:pPr>
       <w:r>
         <w:rPr>
+          <w:rFonts w:cstheme="minorHAnsi"/>
           <w:b/>
           <w:bCs/>
           <w:sz w:val="24"/>
@@ -722,11 +1453,13 @@
           <w:numId w:val="7"/>
         </w:numPr>
         <w:rPr>
-          <w:lang w:val="en-IN"/>
-        </w:rPr>
-      </w:pPr>
-      <w:r>
-        <w:rPr>
+          <w:rFonts w:cstheme="minorHAnsi"/>
+          <w:lang w:val="en-IN"/>
+        </w:rPr>
+      </w:pPr>
+      <w:r>
+        <w:rPr>
+          <w:rFonts w:cstheme="minorHAnsi"/>
           <w:lang w:val="en-IN"/>
         </w:rPr>
         <w:t>Users can like posts</w:t>
@@ -740,11 +1473,13 @@
           <w:numId w:val="7"/>
         </w:numPr>
         <w:rPr>
-          <w:lang w:val="en-IN"/>
-        </w:rPr>
-      </w:pPr>
-      <w:r>
-        <w:rPr>
+          <w:rFonts w:cstheme="minorHAnsi"/>
+          <w:lang w:val="en-IN"/>
+        </w:rPr>
+      </w:pPr>
+      <w:r>
+        <w:rPr>
+          <w:rFonts w:cstheme="minorHAnsi"/>
           <w:lang w:val="en-IN"/>
         </w:rPr>
         <w:t>Users can comment on posts</w:t>
@@ -758,11 +1493,13 @@
           <w:numId w:val="7"/>
         </w:numPr>
         <w:rPr>
-          <w:lang w:val="en-IN"/>
-        </w:rPr>
-      </w:pPr>
-      <w:r>
-        <w:rPr>
+          <w:rFonts w:cstheme="minorHAnsi"/>
+          <w:lang w:val="en-IN"/>
+        </w:rPr>
+      </w:pPr>
+      <w:r>
+        <w:rPr>
+          <w:rFonts w:cstheme="minorHAnsi"/>
           <w:lang w:val="en-IN"/>
         </w:rPr>
         <w:t>Users can delete their own posts</w:t>
@@ -771,11 +1508,13 @@
     <w:p>
       <w:pPr>
         <w:rPr>
-          <w:lang w:val="en-IN"/>
-        </w:rPr>
-      </w:pPr>
-      <w:r>
-        <w:rPr>
+          <w:rFonts w:cstheme="minorHAnsi"/>
+          <w:lang w:val="en-IN"/>
+        </w:rPr>
+      </w:pPr>
+      <w:r>
+        <w:rPr>
+          <w:rFonts w:cstheme="minorHAnsi"/>
           <w:lang w:val="en-IN"/>
         </w:rPr>
         <w:pict w14:anchorId="75E9598B">
@@ -786,6 +1525,7 @@
     <w:p>
       <w:pPr>
         <w:rPr>
+          <w:rFonts w:cstheme="minorHAnsi"/>
           <w:b/>
           <w:bCs/>
           <w:sz w:val="24"/>
@@ -795,6 +1535,7 @@
       </w:pPr>
       <w:r>
         <w:rPr>
+          <w:rFonts w:cstheme="minorHAnsi"/>
           <w:b/>
           <w:bCs/>
           <w:sz w:val="24"/>
@@ -812,11 +1553,13 @@
           <w:numId w:val="8"/>
         </w:numPr>
         <w:rPr>
-          <w:lang w:val="en-IN"/>
-        </w:rPr>
-      </w:pPr>
-      <w:r>
-        <w:rPr>
+          <w:rFonts w:cstheme="minorHAnsi"/>
+          <w:lang w:val="en-IN"/>
+        </w:rPr>
+      </w:pPr>
+      <w:r>
+        <w:rPr>
+          <w:rFonts w:cstheme="minorHAnsi"/>
           <w:lang w:val="en-IN"/>
         </w:rPr>
         <w:t>Users can access a private chatbot interface</w:t>
@@ -830,11 +1573,13 @@
           <w:numId w:val="8"/>
         </w:numPr>
         <w:rPr>
-          <w:lang w:val="en-IN"/>
-        </w:rPr>
-      </w:pPr>
-      <w:r>
-        <w:rPr>
+          <w:rFonts w:cstheme="minorHAnsi"/>
+          <w:lang w:val="en-IN"/>
+        </w:rPr>
+      </w:pPr>
+      <w:r>
+        <w:rPr>
+          <w:rFonts w:cstheme="minorHAnsi"/>
           <w:lang w:val="en-IN"/>
         </w:rPr>
         <w:t>The system sends queries to the Gemini API and returns responses</w:t>
@@ -848,11 +1593,13 @@
           <w:numId w:val="8"/>
         </w:numPr>
         <w:rPr>
-          <w:lang w:val="en-IN"/>
-        </w:rPr>
-      </w:pPr>
-      <w:r>
-        <w:rPr>
+          <w:rFonts w:cstheme="minorHAnsi"/>
+          <w:lang w:val="en-IN"/>
+        </w:rPr>
+      </w:pPr>
+      <w:r>
+        <w:rPr>
+          <w:rFonts w:cstheme="minorHAnsi"/>
           <w:lang w:val="en-IN"/>
         </w:rPr>
         <w:t>Chat history is saved and retrievable</w:t>
@@ -861,21 +1608,15 @@
     <w:p>
       <w:pPr>
         <w:rPr>
-          <w:lang w:val="en-IN"/>
-        </w:rPr>
-      </w:pPr>
-      <w:r>
-        <w:rPr>
-          <w:lang w:val="en-IN"/>
-        </w:rPr>
-        <w:pict w14:anchorId="141D1D30">
-          <v:rect id="_x0000_i1033" style="width:0;height:1.5pt" o:hralign="center" o:hrstd="t" o:hr="t" fillcolor="#a0a0a0" stroked="f"/>
-        </w:pict>
-      </w:r>
-    </w:p>
-    <w:p>
-      <w:pPr>
-        <w:rPr>
+          <w:rFonts w:cstheme="minorHAnsi"/>
+          <w:lang w:val="en-IN"/>
+        </w:rPr>
+      </w:pPr>
+    </w:p>
+    <w:p>
+      <w:pPr>
+        <w:rPr>
+          <w:rFonts w:cstheme="minorHAnsi"/>
           <w:b/>
           <w:bCs/>
           <w:sz w:val="28"/>
@@ -887,6 +1628,7 @@
     <w:p>
       <w:pPr>
         <w:rPr>
+          <w:rFonts w:cstheme="minorHAnsi"/>
           <w:b/>
           <w:bCs/>
           <w:sz w:val="28"/>
@@ -898,6 +1640,7 @@
     <w:p>
       <w:pPr>
         <w:rPr>
+          <w:rFonts w:cstheme="minorHAnsi"/>
           <w:b/>
           <w:bCs/>
           <w:sz w:val="28"/>
@@ -909,6 +1652,7 @@
     <w:p>
       <w:pPr>
         <w:rPr>
+          <w:rFonts w:cstheme="minorHAnsi"/>
           <w:b/>
           <w:bCs/>
           <w:sz w:val="28"/>
@@ -920,6 +1664,7 @@
     <w:p>
       <w:pPr>
         <w:rPr>
+          <w:rFonts w:cstheme="minorHAnsi"/>
           <w:b/>
           <w:bCs/>
           <w:sz w:val="28"/>
@@ -929,6 +1674,7 @@
       </w:pPr>
       <w:r>
         <w:rPr>
+          <w:rFonts w:cstheme="minorHAnsi"/>
           <w:b/>
           <w:bCs/>
           <w:sz w:val="28"/>
@@ -942,6 +1688,7 @@
     <w:p>
       <w:pPr>
         <w:rPr>
+          <w:rFonts w:cstheme="minorHAnsi"/>
           <w:b/>
           <w:bCs/>
           <w:sz w:val="24"/>
@@ -951,6 +1698,7 @@
       </w:pPr>
       <w:r>
         <w:rPr>
+          <w:rFonts w:cstheme="minorHAnsi"/>
           <w:b/>
           <w:bCs/>
           <w:sz w:val="24"/>
@@ -968,11 +1716,13 @@
           <w:numId w:val="9"/>
         </w:numPr>
         <w:rPr>
-          <w:lang w:val="en-IN"/>
-        </w:rPr>
-      </w:pPr>
-      <w:r>
-        <w:rPr>
+          <w:rFonts w:cstheme="minorHAnsi"/>
+          <w:lang w:val="en-IN"/>
+        </w:rPr>
+      </w:pPr>
+      <w:r>
+        <w:rPr>
+          <w:rFonts w:cstheme="minorHAnsi"/>
           <w:lang w:val="en-IN"/>
         </w:rPr>
         <w:t xml:space="preserve">Passwords must be hashed using </w:t>
@@ -980,6 +1730,7 @@
       <w:proofErr w:type="spellStart"/>
       <w:r>
         <w:rPr>
+          <w:rFonts w:cstheme="minorHAnsi"/>
           <w:lang w:val="en-IN"/>
         </w:rPr>
         <w:t>bcrypt</w:t>
@@ -994,11 +1745,13 @@
           <w:numId w:val="9"/>
         </w:numPr>
         <w:rPr>
-          <w:lang w:val="en-IN"/>
-        </w:rPr>
-      </w:pPr>
-      <w:r>
-        <w:rPr>
+          <w:rFonts w:cstheme="minorHAnsi"/>
+          <w:lang w:val="en-IN"/>
+        </w:rPr>
+      </w:pPr>
+      <w:r>
+        <w:rPr>
+          <w:rFonts w:cstheme="minorHAnsi"/>
           <w:lang w:val="en-IN"/>
         </w:rPr>
         <w:t>JWT-based authentication must be implemented</w:t>
@@ -1012,11 +1765,13 @@
           <w:numId w:val="9"/>
         </w:numPr>
         <w:rPr>
-          <w:lang w:val="en-IN"/>
-        </w:rPr>
-      </w:pPr>
-      <w:r>
-        <w:rPr>
+          <w:rFonts w:cstheme="minorHAnsi"/>
+          <w:lang w:val="en-IN"/>
+        </w:rPr>
+      </w:pPr>
+      <w:r>
+        <w:rPr>
+          <w:rFonts w:cstheme="minorHAnsi"/>
           <w:lang w:val="en-IN"/>
         </w:rPr>
         <w:t>API endpoints must be secured</w:t>
@@ -1025,11 +1780,13 @@
     <w:p>
       <w:pPr>
         <w:rPr>
-          <w:lang w:val="en-IN"/>
-        </w:rPr>
-      </w:pPr>
-      <w:r>
-        <w:rPr>
+          <w:rFonts w:cstheme="minorHAnsi"/>
+          <w:lang w:val="en-IN"/>
+        </w:rPr>
+      </w:pPr>
+      <w:r>
+        <w:rPr>
+          <w:rFonts w:cstheme="minorHAnsi"/>
           <w:lang w:val="en-IN"/>
         </w:rPr>
         <w:pict w14:anchorId="3BF57F4C">
@@ -1040,6 +1797,7 @@
     <w:p>
       <w:pPr>
         <w:rPr>
+          <w:rFonts w:cstheme="minorHAnsi"/>
           <w:b/>
           <w:bCs/>
           <w:sz w:val="24"/>
@@ -1049,6 +1807,7 @@
       </w:pPr>
       <w:r>
         <w:rPr>
+          <w:rFonts w:cstheme="minorHAnsi"/>
           <w:b/>
           <w:bCs/>
           <w:sz w:val="24"/>
@@ -1066,11 +1825,13 @@
           <w:numId w:val="10"/>
         </w:numPr>
         <w:rPr>
-          <w:lang w:val="en-IN"/>
-        </w:rPr>
-      </w:pPr>
-      <w:r>
-        <w:rPr>
+          <w:rFonts w:cstheme="minorHAnsi"/>
+          <w:lang w:val="en-IN"/>
+        </w:rPr>
+      </w:pPr>
+      <w:r>
+        <w:rPr>
+          <w:rFonts w:cstheme="minorHAnsi"/>
           <w:lang w:val="en-IN"/>
         </w:rPr>
         <w:t>Anonymous posting must be strictly enforced</w:t>
@@ -1084,11 +1845,13 @@
           <w:numId w:val="10"/>
         </w:numPr>
         <w:rPr>
-          <w:lang w:val="en-IN"/>
-        </w:rPr>
-      </w:pPr>
-      <w:r>
-        <w:rPr>
+          <w:rFonts w:cstheme="minorHAnsi"/>
+          <w:lang w:val="en-IN"/>
+        </w:rPr>
+      </w:pPr>
+      <w:r>
+        <w:rPr>
+          <w:rFonts w:cstheme="minorHAnsi"/>
           <w:lang w:val="en-IN"/>
         </w:rPr>
         <w:t>User identity must not be exposed when anonymity is enabled</w:t>
@@ -1097,11 +1860,13 @@
     <w:p>
       <w:pPr>
         <w:rPr>
-          <w:lang w:val="en-IN"/>
-        </w:rPr>
-      </w:pPr>
-      <w:r>
-        <w:rPr>
+          <w:rFonts w:cstheme="minorHAnsi"/>
+          <w:lang w:val="en-IN"/>
+        </w:rPr>
+      </w:pPr>
+      <w:r>
+        <w:rPr>
+          <w:rFonts w:cstheme="minorHAnsi"/>
           <w:lang w:val="en-IN"/>
         </w:rPr>
         <w:pict w14:anchorId="54215DAD">
@@ -1112,6 +1877,7 @@
     <w:p>
       <w:pPr>
         <w:rPr>
+          <w:rFonts w:cstheme="minorHAnsi"/>
           <w:b/>
           <w:bCs/>
           <w:sz w:val="24"/>
@@ -1121,6 +1887,7 @@
       </w:pPr>
       <w:r>
         <w:rPr>
+          <w:rFonts w:cstheme="minorHAnsi"/>
           <w:b/>
           <w:bCs/>
           <w:sz w:val="24"/>
@@ -1138,11 +1905,13 @@
           <w:numId w:val="11"/>
         </w:numPr>
         <w:rPr>
-          <w:lang w:val="en-IN"/>
-        </w:rPr>
-      </w:pPr>
-      <w:r>
-        <w:rPr>
+          <w:rFonts w:cstheme="minorHAnsi"/>
+          <w:lang w:val="en-IN"/>
+        </w:rPr>
+      </w:pPr>
+      <w:r>
+        <w:rPr>
+          <w:rFonts w:cstheme="minorHAnsi"/>
           <w:lang w:val="en-IN"/>
         </w:rPr>
         <w:t>The community feed should load quickly</w:t>
@@ -1156,11 +1925,13 @@
           <w:numId w:val="11"/>
         </w:numPr>
         <w:rPr>
-          <w:lang w:val="en-IN"/>
-        </w:rPr>
-      </w:pPr>
-      <w:r>
-        <w:rPr>
+          <w:rFonts w:cstheme="minorHAnsi"/>
+          <w:lang w:val="en-IN"/>
+        </w:rPr>
+      </w:pPr>
+      <w:r>
+        <w:rPr>
+          <w:rFonts w:cstheme="minorHAnsi"/>
           <w:lang w:val="en-IN"/>
         </w:rPr>
         <w:t>Efficient database queries should be used</w:t>
@@ -1174,11 +1945,13 @@
           <w:numId w:val="11"/>
         </w:numPr>
         <w:rPr>
-          <w:lang w:val="en-IN"/>
-        </w:rPr>
-      </w:pPr>
-      <w:r>
-        <w:rPr>
+          <w:rFonts w:cstheme="minorHAnsi"/>
+          <w:lang w:val="en-IN"/>
+        </w:rPr>
+      </w:pPr>
+      <w:r>
+        <w:rPr>
+          <w:rFonts w:cstheme="minorHAnsi"/>
           <w:lang w:val="en-IN"/>
         </w:rPr>
         <w:t>Pagination or infinite scrolling should be implemented</w:t>
@@ -1187,11 +1960,13 @@
     <w:p>
       <w:pPr>
         <w:rPr>
-          <w:lang w:val="en-IN"/>
-        </w:rPr>
-      </w:pPr>
-      <w:r>
-        <w:rPr>
+          <w:rFonts w:cstheme="minorHAnsi"/>
+          <w:lang w:val="en-IN"/>
+        </w:rPr>
+      </w:pPr>
+      <w:r>
+        <w:rPr>
+          <w:rFonts w:cstheme="minorHAnsi"/>
           <w:lang w:val="en-IN"/>
         </w:rPr>
         <w:pict w14:anchorId="1F13923D">
@@ -1202,6 +1977,7 @@
     <w:p>
       <w:pPr>
         <w:rPr>
+          <w:rFonts w:cstheme="minorHAnsi"/>
           <w:b/>
           <w:bCs/>
           <w:sz w:val="24"/>
@@ -1211,6 +1987,7 @@
       </w:pPr>
       <w:r>
         <w:rPr>
+          <w:rFonts w:cstheme="minorHAnsi"/>
           <w:b/>
           <w:bCs/>
           <w:sz w:val="24"/>
@@ -1228,11 +2005,13 @@
           <w:numId w:val="12"/>
         </w:numPr>
         <w:rPr>
-          <w:lang w:val="en-IN"/>
-        </w:rPr>
-      </w:pPr>
-      <w:r>
-        <w:rPr>
+          <w:rFonts w:cstheme="minorHAnsi"/>
+          <w:lang w:val="en-IN"/>
+        </w:rPr>
+      </w:pPr>
+      <w:r>
+        <w:rPr>
+          <w:rFonts w:cstheme="minorHAnsi"/>
           <w:lang w:val="en-IN"/>
         </w:rPr>
         <w:t>The application must be fully responsive</w:t>
@@ -1246,11 +2025,13 @@
           <w:numId w:val="12"/>
         </w:numPr>
         <w:rPr>
-          <w:lang w:val="en-IN"/>
-        </w:rPr>
-      </w:pPr>
-      <w:r>
-        <w:rPr>
+          <w:rFonts w:cstheme="minorHAnsi"/>
+          <w:lang w:val="en-IN"/>
+        </w:rPr>
+      </w:pPr>
+      <w:r>
+        <w:rPr>
+          <w:rFonts w:cstheme="minorHAnsi"/>
           <w:lang w:val="en-IN"/>
         </w:rPr>
         <w:t>It should work seamlessly on mobile, tablet, and desktop devices</w:t>
@@ -1259,11 +2040,13 @@
     <w:p>
       <w:pPr>
         <w:rPr>
-          <w:lang w:val="en-IN"/>
-        </w:rPr>
-      </w:pPr>
-      <w:r>
-        <w:rPr>
+          <w:rFonts w:cstheme="minorHAnsi"/>
+          <w:lang w:val="en-IN"/>
+        </w:rPr>
+      </w:pPr>
+      <w:r>
+        <w:rPr>
+          <w:rFonts w:cstheme="minorHAnsi"/>
           <w:lang w:val="en-IN"/>
         </w:rPr>
         <w:pict w14:anchorId="4CDDE036">
@@ -1274,6 +2057,7 @@
     <w:p>
       <w:pPr>
         <w:rPr>
+          <w:rFonts w:cstheme="minorHAnsi"/>
           <w:b/>
           <w:bCs/>
           <w:sz w:val="28"/>
@@ -1283,6 +2067,7 @@
       </w:pPr>
       <w:r>
         <w:rPr>
+          <w:rFonts w:cstheme="minorHAnsi"/>
           <w:b/>
           <w:bCs/>
           <w:sz w:val="28"/>
@@ -1295,12 +2080,14 @@
     <w:p>
       <w:pPr>
         <w:rPr>
+          <w:rFonts w:cstheme="minorHAnsi"/>
           <w:lang w:val="en-IN"/>
         </w:rPr>
       </w:pPr>
       <w:proofErr w:type="spellStart"/>
       <w:r>
         <w:rPr>
+          <w:rFonts w:cstheme="minorHAnsi"/>
           <w:lang w:val="en-IN"/>
         </w:rPr>
         <w:t>HerCircle</w:t>
@@ -1308,6 +2095,7 @@
       <w:proofErr w:type="spellEnd"/>
       <w:r>
         <w:rPr>
+          <w:rFonts w:cstheme="minorHAnsi"/>
           <w:lang w:val="en-IN"/>
         </w:rPr>
         <w:t xml:space="preserve"> follows a Client-Server Architecture:</w:t>
@@ -1316,11 +2104,13 @@
     <w:p>
       <w:pPr>
         <w:rPr>
-          <w:lang w:val="en-IN"/>
-        </w:rPr>
-      </w:pPr>
-      <w:r>
-        <w:rPr>
+          <w:rFonts w:cstheme="minorHAnsi"/>
+          <w:lang w:val="en-IN"/>
+        </w:rPr>
+      </w:pPr>
+      <w:r>
+        <w:rPr>
+          <w:rFonts w:cstheme="minorHAnsi"/>
           <w:b/>
           <w:bCs/>
           <w:lang w:val="en-IN"/>
@@ -1329,6 +2119,7 @@
       </w:r>
       <w:r>
         <w:rPr>
+          <w:rFonts w:cstheme="minorHAnsi"/>
           <w:lang w:val="en-IN"/>
         </w:rPr>
         <w:br/>
@@ -1338,11 +2129,13 @@
     <w:p>
       <w:pPr>
         <w:rPr>
-          <w:lang w:val="en-IN"/>
-        </w:rPr>
-      </w:pPr>
-      <w:r>
-        <w:rPr>
+          <w:rFonts w:cstheme="minorHAnsi"/>
+          <w:lang w:val="en-IN"/>
+        </w:rPr>
+      </w:pPr>
+      <w:r>
+        <w:rPr>
+          <w:rFonts w:cstheme="minorHAnsi"/>
           <w:b/>
           <w:bCs/>
           <w:lang w:val="en-IN"/>
@@ -1351,6 +2144,7 @@
       </w:r>
       <w:r>
         <w:rPr>
+          <w:rFonts w:cstheme="minorHAnsi"/>
           <w:lang w:val="en-IN"/>
         </w:rPr>
         <w:br/>
@@ -1360,11 +2154,13 @@
     <w:p>
       <w:pPr>
         <w:rPr>
-          <w:lang w:val="en-IN"/>
-        </w:rPr>
-      </w:pPr>
-      <w:r>
-        <w:rPr>
+          <w:rFonts w:cstheme="minorHAnsi"/>
+          <w:lang w:val="en-IN"/>
+        </w:rPr>
+      </w:pPr>
+      <w:r>
+        <w:rPr>
+          <w:rFonts w:cstheme="minorHAnsi"/>
           <w:b/>
           <w:bCs/>
           <w:lang w:val="en-IN"/>
@@ -1373,6 +2169,7 @@
       </w:r>
       <w:r>
         <w:rPr>
+          <w:rFonts w:cstheme="minorHAnsi"/>
           <w:lang w:val="en-IN"/>
         </w:rPr>
         <w:br/>
@@ -1382,21 +2179,15 @@
     <w:p>
       <w:pPr>
         <w:rPr>
-          <w:lang w:val="en-IN"/>
-        </w:rPr>
-      </w:pPr>
-      <w:r>
-        <w:rPr>
-          <w:lang w:val="en-IN"/>
-        </w:rPr>
-        <w:pict w14:anchorId="76EF5E57">
-          <v:rect id="_x0000_i1038" style="width:0;height:1.5pt" o:hralign="center" o:hrstd="t" o:hr="t" fillcolor="#a0a0a0" stroked="f"/>
-        </w:pict>
-      </w:r>
-    </w:p>
-    <w:p>
-      <w:pPr>
-        <w:rPr>
+          <w:rFonts w:cstheme="minorHAnsi"/>
+          <w:lang w:val="en-IN"/>
+        </w:rPr>
+      </w:pPr>
+    </w:p>
+    <w:p>
+      <w:pPr>
+        <w:rPr>
+          <w:rFonts w:cstheme="minorHAnsi"/>
           <w:b/>
           <w:bCs/>
           <w:sz w:val="28"/>
@@ -1406,6 +2197,7 @@
       </w:pPr>
       <w:r>
         <w:rPr>
+          <w:rFonts w:cstheme="minorHAnsi"/>
           <w:b/>
           <w:bCs/>
           <w:sz w:val="28"/>
@@ -1419,6 +2211,7 @@
     <w:p>
       <w:pPr>
         <w:rPr>
+          <w:rFonts w:cstheme="minorHAnsi"/>
           <w:b/>
           <w:bCs/>
           <w:sz w:val="24"/>
@@ -1428,6 +2221,7 @@
       </w:pPr>
       <w:r>
         <w:rPr>
+          <w:rFonts w:cstheme="minorHAnsi"/>
           <w:b/>
           <w:bCs/>
           <w:sz w:val="24"/>
@@ -1437,66 +2231,245 @@
         <w:t>6.1 User Collection</w:t>
       </w:r>
     </w:p>
-    <w:p>
-      <w:pPr>
-        <w:rPr>
-          <w:lang w:val="en-IN"/>
-        </w:rPr>
-      </w:pPr>
-      <w:r>
-        <w:rPr>
-          <w:lang w:val="en-IN"/>
-        </w:rPr>
-        <w:t xml:space="preserve">_id: </w:t>
-      </w:r>
-      <w:proofErr w:type="spellStart"/>
-      <w:r>
-        <w:rPr>
-          <w:lang w:val="en-IN"/>
-        </w:rPr>
-        <w:t>ObjectId</w:t>
-      </w:r>
-      <w:proofErr w:type="spellEnd"/>
-      <w:r>
-        <w:rPr>
-          <w:lang w:val="en-IN"/>
-        </w:rPr>
-        <w:br/>
-        <w:t>username: String (Unique)</w:t>
-      </w:r>
-      <w:r>
-        <w:rPr>
-          <w:lang w:val="en-IN"/>
-        </w:rPr>
-        <w:br/>
-        <w:t>email: String (Unique)</w:t>
-      </w:r>
-      <w:r>
-        <w:rPr>
-          <w:lang w:val="en-IN"/>
-        </w:rPr>
-        <w:br/>
-        <w:t>password: String (Hashed)</w:t>
-      </w:r>
-    </w:p>
-    <w:p>
-      <w:pPr>
-        <w:rPr>
-          <w:lang w:val="en-IN"/>
-        </w:rPr>
-      </w:pPr>
-      <w:r>
-        <w:rPr>
-          <w:lang w:val="en-IN"/>
-        </w:rPr>
-        <w:pict w14:anchorId="580330EE">
-          <v:rect id="_x0000_i1039" style="width:0;height:1.5pt" o:hralign="center" o:hrstd="t" o:hr="t" fillcolor="#a0a0a0" stroked="f"/>
-        </w:pict>
-      </w:r>
-    </w:p>
-    <w:p>
-      <w:pPr>
-        <w:rPr>
+    <w:tbl>
+      <w:tblPr>
+        <w:tblStyle w:val="TableGrid"/>
+        <w:tblW w:w="0" w:type="auto"/>
+        <w:jc w:val="center"/>
+        <w:tblLook w:val="04A0" w:firstRow="1" w:lastRow="0" w:firstColumn="1" w:lastColumn="0" w:noHBand="0" w:noVBand="1"/>
+      </w:tblPr>
+      <w:tblGrid>
+        <w:gridCol w:w="4320"/>
+        <w:gridCol w:w="4320"/>
+      </w:tblGrid>
+      <w:tr>
+        <w:trPr>
+          <w:jc w:val="center"/>
+        </w:trPr>
+        <w:tc>
+          <w:tcPr>
+            <w:tcW w:w="4320" w:type="dxa"/>
+          </w:tcPr>
+          <w:p>
+            <w:pPr>
+              <w:rPr>
+                <w:rFonts w:cstheme="minorHAnsi"/>
+                <w:b/>
+                <w:bCs/>
+              </w:rPr>
+            </w:pPr>
+            <w:r>
+              <w:rPr>
+                <w:rFonts w:cstheme="minorHAnsi"/>
+                <w:b/>
+                <w:bCs/>
+              </w:rPr>
+              <w:t>Field Name</w:t>
+            </w:r>
+          </w:p>
+        </w:tc>
+        <w:tc>
+          <w:tcPr>
+            <w:tcW w:w="4320" w:type="dxa"/>
+          </w:tcPr>
+          <w:p>
+            <w:pPr>
+              <w:rPr>
+                <w:rFonts w:cstheme="minorHAnsi"/>
+                <w:b/>
+                <w:bCs/>
+              </w:rPr>
+            </w:pPr>
+            <w:r>
+              <w:rPr>
+                <w:rFonts w:cstheme="minorHAnsi"/>
+                <w:b/>
+                <w:bCs/>
+              </w:rPr>
+              <w:t>Data Type / Description</w:t>
+            </w:r>
+          </w:p>
+        </w:tc>
+      </w:tr>
+      <w:tr>
+        <w:trPr>
+          <w:jc w:val="center"/>
+        </w:trPr>
+        <w:tc>
+          <w:tcPr>
+            <w:tcW w:w="4320" w:type="dxa"/>
+          </w:tcPr>
+          <w:p>
+            <w:pPr>
+              <w:rPr>
+                <w:rFonts w:cstheme="minorHAnsi"/>
+              </w:rPr>
+            </w:pPr>
+            <w:r>
+              <w:rPr>
+                <w:rFonts w:cstheme="minorHAnsi"/>
+              </w:rPr>
+              <w:t>_id</w:t>
+            </w:r>
+          </w:p>
+        </w:tc>
+        <w:tc>
+          <w:tcPr>
+            <w:tcW w:w="4320" w:type="dxa"/>
+          </w:tcPr>
+          <w:p>
+            <w:pPr>
+              <w:rPr>
+                <w:rFonts w:cstheme="minorHAnsi"/>
+              </w:rPr>
+            </w:pPr>
+            <w:proofErr w:type="spellStart"/>
+            <w:r>
+              <w:rPr>
+                <w:rFonts w:cstheme="minorHAnsi"/>
+              </w:rPr>
+              <w:t>ObjectId</w:t>
+            </w:r>
+            <w:proofErr w:type="spellEnd"/>
+          </w:p>
+        </w:tc>
+      </w:tr>
+      <w:tr>
+        <w:trPr>
+          <w:jc w:val="center"/>
+        </w:trPr>
+        <w:tc>
+          <w:tcPr>
+            <w:tcW w:w="4320" w:type="dxa"/>
+          </w:tcPr>
+          <w:p>
+            <w:pPr>
+              <w:rPr>
+                <w:rFonts w:cstheme="minorHAnsi"/>
+              </w:rPr>
+            </w:pPr>
+            <w:r>
+              <w:rPr>
+                <w:rFonts w:cstheme="minorHAnsi"/>
+              </w:rPr>
+              <w:t>username</w:t>
+            </w:r>
+          </w:p>
+        </w:tc>
+        <w:tc>
+          <w:tcPr>
+            <w:tcW w:w="4320" w:type="dxa"/>
+          </w:tcPr>
+          <w:p>
+            <w:pPr>
+              <w:rPr>
+                <w:rFonts w:cstheme="minorHAnsi"/>
+              </w:rPr>
+            </w:pPr>
+            <w:r>
+              <w:rPr>
+                <w:rFonts w:cstheme="minorHAnsi"/>
+              </w:rPr>
+              <w:t>String (Unique)</w:t>
+            </w:r>
+          </w:p>
+        </w:tc>
+      </w:tr>
+      <w:tr>
+        <w:trPr>
+          <w:jc w:val="center"/>
+        </w:trPr>
+        <w:tc>
+          <w:tcPr>
+            <w:tcW w:w="4320" w:type="dxa"/>
+          </w:tcPr>
+          <w:p>
+            <w:pPr>
+              <w:rPr>
+                <w:rFonts w:cstheme="minorHAnsi"/>
+              </w:rPr>
+            </w:pPr>
+            <w:r>
+              <w:rPr>
+                <w:rFonts w:cstheme="minorHAnsi"/>
+              </w:rPr>
+              <w:t>email</w:t>
+            </w:r>
+          </w:p>
+        </w:tc>
+        <w:tc>
+          <w:tcPr>
+            <w:tcW w:w="4320" w:type="dxa"/>
+          </w:tcPr>
+          <w:p>
+            <w:pPr>
+              <w:rPr>
+                <w:rFonts w:cstheme="minorHAnsi"/>
+              </w:rPr>
+            </w:pPr>
+            <w:r>
+              <w:rPr>
+                <w:rFonts w:cstheme="minorHAnsi"/>
+              </w:rPr>
+              <w:t>String (Unique)</w:t>
+            </w:r>
+          </w:p>
+        </w:tc>
+      </w:tr>
+      <w:tr>
+        <w:trPr>
+          <w:jc w:val="center"/>
+        </w:trPr>
+        <w:tc>
+          <w:tcPr>
+            <w:tcW w:w="4320" w:type="dxa"/>
+          </w:tcPr>
+          <w:p>
+            <w:pPr>
+              <w:rPr>
+                <w:rFonts w:cstheme="minorHAnsi"/>
+              </w:rPr>
+            </w:pPr>
+            <w:r>
+              <w:rPr>
+                <w:rFonts w:cstheme="minorHAnsi"/>
+              </w:rPr>
+              <w:t>password</w:t>
+            </w:r>
+          </w:p>
+        </w:tc>
+        <w:tc>
+          <w:tcPr>
+            <w:tcW w:w="4320" w:type="dxa"/>
+          </w:tcPr>
+          <w:p>
+            <w:pPr>
+              <w:rPr>
+                <w:rFonts w:cstheme="minorHAnsi"/>
+              </w:rPr>
+            </w:pPr>
+            <w:r>
+              <w:rPr>
+                <w:rFonts w:cstheme="minorHAnsi"/>
+              </w:rPr>
+              <w:t>String (Hashed)</w:t>
+            </w:r>
+          </w:p>
+        </w:tc>
+      </w:tr>
+    </w:tbl>
+    <w:p>
+      <w:pPr>
+        <w:rPr>
+          <w:rFonts w:cstheme="minorHAnsi"/>
+          <w:lang w:val="en-IN"/>
+        </w:rPr>
+      </w:pPr>
+    </w:p>
+    <w:p>
+      <w:pPr>
+        <w:rPr>
+          <w:rFonts w:cstheme="minorHAnsi"/>
           <w:b/>
           <w:bCs/>
           <w:sz w:val="24"/>
@@ -1506,6 +2479,7 @@
       </w:pPr>
       <w:r>
         <w:rPr>
+          <w:rFonts w:cstheme="minorHAnsi"/>
           <w:b/>
           <w:bCs/>
           <w:sz w:val="24"/>
@@ -1515,148 +2489,390 @@
         <w:t>6.2 Post Collection</w:t>
       </w:r>
     </w:p>
-    <w:p>
-      <w:pPr>
-        <w:rPr>
-          <w:lang w:val="en-IN"/>
-        </w:rPr>
-      </w:pPr>
-      <w:r>
-        <w:rPr>
-          <w:lang w:val="en-IN"/>
-        </w:rPr>
-        <w:t xml:space="preserve">_id: </w:t>
-      </w:r>
-      <w:proofErr w:type="spellStart"/>
-      <w:r>
-        <w:rPr>
-          <w:lang w:val="en-IN"/>
-        </w:rPr>
-        <w:t>ObjectId</w:t>
-      </w:r>
-      <w:proofErr w:type="spellEnd"/>
-      <w:r>
-        <w:rPr>
-          <w:lang w:val="en-IN"/>
-        </w:rPr>
-        <w:br/>
-      </w:r>
-      <w:proofErr w:type="spellStart"/>
-      <w:r>
-        <w:rPr>
-          <w:lang w:val="en-IN"/>
-        </w:rPr>
-        <w:t>author_id</w:t>
-      </w:r>
-      <w:proofErr w:type="spellEnd"/>
-      <w:r>
-        <w:rPr>
-          <w:lang w:val="en-IN"/>
-        </w:rPr>
-        <w:t xml:space="preserve">: </w:t>
-      </w:r>
-      <w:proofErr w:type="spellStart"/>
-      <w:r>
-        <w:rPr>
-          <w:lang w:val="en-IN"/>
-        </w:rPr>
-        <w:t>ObjectId</w:t>
-      </w:r>
-      <w:proofErr w:type="spellEnd"/>
-      <w:r>
-        <w:rPr>
-          <w:lang w:val="en-IN"/>
-        </w:rPr>
-        <w:t xml:space="preserve"> (Reference to User)</w:t>
-      </w:r>
-      <w:r>
-        <w:rPr>
-          <w:lang w:val="en-IN"/>
-        </w:rPr>
-        <w:br/>
-        <w:t>content: String</w:t>
-      </w:r>
-      <w:r>
-        <w:rPr>
-          <w:lang w:val="en-IN"/>
-        </w:rPr>
-        <w:br/>
-      </w:r>
-      <w:proofErr w:type="spellStart"/>
-      <w:r>
-        <w:rPr>
-          <w:lang w:val="en-IN"/>
-        </w:rPr>
-        <w:t>isAnonymous</w:t>
-      </w:r>
-      <w:proofErr w:type="spellEnd"/>
-      <w:r>
-        <w:rPr>
-          <w:lang w:val="en-IN"/>
-        </w:rPr>
-        <w:t>: Boolean (default: false)</w:t>
-      </w:r>
-      <w:r>
-        <w:rPr>
-          <w:lang w:val="en-IN"/>
-        </w:rPr>
-        <w:br/>
-        <w:t>topic: String</w:t>
-      </w:r>
-      <w:r>
-        <w:rPr>
-          <w:lang w:val="en-IN"/>
-        </w:rPr>
-        <w:br/>
-        <w:t xml:space="preserve">likes: Array of </w:t>
-      </w:r>
-      <w:proofErr w:type="spellStart"/>
-      <w:r>
-        <w:rPr>
-          <w:lang w:val="en-IN"/>
-        </w:rPr>
-        <w:t>ObjectIds</w:t>
-      </w:r>
-      <w:proofErr w:type="spellEnd"/>
-      <w:r>
-        <w:rPr>
-          <w:lang w:val="en-IN"/>
-        </w:rPr>
-        <w:br/>
-      </w:r>
-      <w:proofErr w:type="spellStart"/>
-      <w:r>
-        <w:rPr>
-          <w:lang w:val="en-IN"/>
-        </w:rPr>
-        <w:t>createdAt</w:t>
-      </w:r>
-      <w:proofErr w:type="spellEnd"/>
-      <w:r>
-        <w:rPr>
-          <w:lang w:val="en-IN"/>
-        </w:rPr>
-        <w:t>: Date</w:t>
-      </w:r>
-    </w:p>
-    <w:p>
-      <w:pPr>
-        <w:rPr>
-          <w:lang w:val="en-IN"/>
-        </w:rPr>
-      </w:pPr>
-      <w:r>
-        <w:rPr>
-          <w:lang w:val="en-IN"/>
-        </w:rPr>
-        <w:pict w14:anchorId="0D790816">
-          <v:rect id="_x0000_i1040" style="width:0;height:1.5pt" o:hralign="center" o:hrstd="t" o:hr="t" fillcolor="#a0a0a0" stroked="f"/>
-        </w:pict>
-      </w:r>
-    </w:p>
-    <w:p>
-      <w:pPr>
-        <w:rPr>
+    <w:tbl>
+      <w:tblPr>
+        <w:tblStyle w:val="TableGrid"/>
+        <w:tblW w:w="0" w:type="auto"/>
+        <w:jc w:val="center"/>
+        <w:tblLook w:val="04A0" w:firstRow="1" w:lastRow="0" w:firstColumn="1" w:lastColumn="0" w:noHBand="0" w:noVBand="1"/>
+      </w:tblPr>
+      <w:tblGrid>
+        <w:gridCol w:w="4320"/>
+        <w:gridCol w:w="4320"/>
+      </w:tblGrid>
+      <w:tr>
+        <w:trPr>
+          <w:jc w:val="center"/>
+        </w:trPr>
+        <w:tc>
+          <w:tcPr>
+            <w:tcW w:w="4320" w:type="dxa"/>
+          </w:tcPr>
+          <w:p>
+            <w:pPr>
+              <w:rPr>
+                <w:rFonts w:cstheme="minorHAnsi"/>
+                <w:b/>
+                <w:bCs/>
+              </w:rPr>
+            </w:pPr>
+            <w:r>
+              <w:rPr>
+                <w:rFonts w:cstheme="minorHAnsi"/>
+                <w:b/>
+                <w:bCs/>
+              </w:rPr>
+              <w:t>Field Name</w:t>
+            </w:r>
+          </w:p>
+        </w:tc>
+        <w:tc>
+          <w:tcPr>
+            <w:tcW w:w="4320" w:type="dxa"/>
+          </w:tcPr>
+          <w:p>
+            <w:pPr>
+              <w:rPr>
+                <w:rFonts w:cstheme="minorHAnsi"/>
+                <w:b/>
+                <w:bCs/>
+              </w:rPr>
+            </w:pPr>
+            <w:r>
+              <w:rPr>
+                <w:rFonts w:cstheme="minorHAnsi"/>
+                <w:b/>
+                <w:bCs/>
+              </w:rPr>
+              <w:t>Data Type / Description</w:t>
+            </w:r>
+          </w:p>
+        </w:tc>
+      </w:tr>
+      <w:tr>
+        <w:trPr>
+          <w:jc w:val="center"/>
+        </w:trPr>
+        <w:tc>
+          <w:tcPr>
+            <w:tcW w:w="4320" w:type="dxa"/>
+          </w:tcPr>
+          <w:p>
+            <w:pPr>
+              <w:rPr>
+                <w:rFonts w:cstheme="minorHAnsi"/>
+              </w:rPr>
+            </w:pPr>
+            <w:r>
+              <w:rPr>
+                <w:rFonts w:cstheme="minorHAnsi"/>
+              </w:rPr>
+              <w:t>_id</w:t>
+            </w:r>
+          </w:p>
+        </w:tc>
+        <w:tc>
+          <w:tcPr>
+            <w:tcW w:w="4320" w:type="dxa"/>
+          </w:tcPr>
+          <w:p>
+            <w:pPr>
+              <w:rPr>
+                <w:rFonts w:cstheme="minorHAnsi"/>
+              </w:rPr>
+            </w:pPr>
+            <w:proofErr w:type="spellStart"/>
+            <w:r>
+              <w:rPr>
+                <w:rFonts w:cstheme="minorHAnsi"/>
+              </w:rPr>
+              <w:t>ObjectId</w:t>
+            </w:r>
+            <w:proofErr w:type="spellEnd"/>
+          </w:p>
+        </w:tc>
+      </w:tr>
+      <w:tr>
+        <w:trPr>
+          <w:jc w:val="center"/>
+        </w:trPr>
+        <w:tc>
+          <w:tcPr>
+            <w:tcW w:w="4320" w:type="dxa"/>
+          </w:tcPr>
+          <w:p>
+            <w:pPr>
+              <w:rPr>
+                <w:rFonts w:cstheme="minorHAnsi"/>
+              </w:rPr>
+            </w:pPr>
+            <w:proofErr w:type="spellStart"/>
+            <w:r>
+              <w:rPr>
+                <w:rFonts w:cstheme="minorHAnsi"/>
+              </w:rPr>
+              <w:t>author_id</w:t>
+            </w:r>
+            <w:proofErr w:type="spellEnd"/>
+          </w:p>
+        </w:tc>
+        <w:tc>
+          <w:tcPr>
+            <w:tcW w:w="4320" w:type="dxa"/>
+          </w:tcPr>
+          <w:p>
+            <w:pPr>
+              <w:rPr>
+                <w:rFonts w:cstheme="minorHAnsi"/>
+              </w:rPr>
+            </w:pPr>
+            <w:proofErr w:type="spellStart"/>
+            <w:r>
+              <w:rPr>
+                <w:rFonts w:cstheme="minorHAnsi"/>
+              </w:rPr>
+              <w:t>ObjectId</w:t>
+            </w:r>
+            <w:proofErr w:type="spellEnd"/>
+            <w:r>
+              <w:rPr>
+                <w:rFonts w:cstheme="minorHAnsi"/>
+              </w:rPr>
+              <w:t xml:space="preserve"> (Ref User)</w:t>
+            </w:r>
+          </w:p>
+        </w:tc>
+      </w:tr>
+      <w:tr>
+        <w:trPr>
+          <w:jc w:val="center"/>
+        </w:trPr>
+        <w:tc>
+          <w:tcPr>
+            <w:tcW w:w="4320" w:type="dxa"/>
+          </w:tcPr>
+          <w:p>
+            <w:pPr>
+              <w:rPr>
+                <w:rFonts w:cstheme="minorHAnsi"/>
+              </w:rPr>
+            </w:pPr>
+            <w:r>
+              <w:rPr>
+                <w:rFonts w:cstheme="minorHAnsi"/>
+              </w:rPr>
+              <w:t>content</w:t>
+            </w:r>
+          </w:p>
+        </w:tc>
+        <w:tc>
+          <w:tcPr>
+            <w:tcW w:w="4320" w:type="dxa"/>
+          </w:tcPr>
+          <w:p>
+            <w:pPr>
+              <w:rPr>
+                <w:rFonts w:cstheme="minorHAnsi"/>
+              </w:rPr>
+            </w:pPr>
+            <w:r>
+              <w:rPr>
+                <w:rFonts w:cstheme="minorHAnsi"/>
+              </w:rPr>
+              <w:t>String</w:t>
+            </w:r>
+          </w:p>
+        </w:tc>
+      </w:tr>
+      <w:tr>
+        <w:trPr>
+          <w:jc w:val="center"/>
+        </w:trPr>
+        <w:tc>
+          <w:tcPr>
+            <w:tcW w:w="4320" w:type="dxa"/>
+          </w:tcPr>
+          <w:p>
+            <w:pPr>
+              <w:rPr>
+                <w:rFonts w:cstheme="minorHAnsi"/>
+              </w:rPr>
+            </w:pPr>
+            <w:proofErr w:type="spellStart"/>
+            <w:r>
+              <w:rPr>
+                <w:rFonts w:cstheme="minorHAnsi"/>
+              </w:rPr>
+              <w:t>isAnonymous</w:t>
+            </w:r>
+            <w:proofErr w:type="spellEnd"/>
+          </w:p>
+        </w:tc>
+        <w:tc>
+          <w:tcPr>
+            <w:tcW w:w="4320" w:type="dxa"/>
+          </w:tcPr>
+          <w:p>
+            <w:pPr>
+              <w:rPr>
+                <w:rFonts w:cstheme="minorHAnsi"/>
+              </w:rPr>
+            </w:pPr>
+            <w:r>
+              <w:rPr>
+                <w:rFonts w:cstheme="minorHAnsi"/>
+              </w:rPr>
+              <w:t>Boolean (default: false)</w:t>
+            </w:r>
+          </w:p>
+        </w:tc>
+      </w:tr>
+      <w:tr>
+        <w:trPr>
+          <w:jc w:val="center"/>
+        </w:trPr>
+        <w:tc>
+          <w:tcPr>
+            <w:tcW w:w="4320" w:type="dxa"/>
+          </w:tcPr>
+          <w:p>
+            <w:pPr>
+              <w:rPr>
+                <w:rFonts w:cstheme="minorHAnsi"/>
+              </w:rPr>
+            </w:pPr>
+            <w:r>
+              <w:rPr>
+                <w:rFonts w:cstheme="minorHAnsi"/>
+              </w:rPr>
+              <w:t>topic</w:t>
+            </w:r>
+          </w:p>
+        </w:tc>
+        <w:tc>
+          <w:tcPr>
+            <w:tcW w:w="4320" w:type="dxa"/>
+          </w:tcPr>
+          <w:p>
+            <w:pPr>
+              <w:rPr>
+                <w:rFonts w:cstheme="minorHAnsi"/>
+              </w:rPr>
+            </w:pPr>
+            <w:r>
+              <w:rPr>
+                <w:rFonts w:cstheme="minorHAnsi"/>
+              </w:rPr>
+              <w:t>String</w:t>
+            </w:r>
+          </w:p>
+        </w:tc>
+      </w:tr>
+      <w:tr>
+        <w:trPr>
+          <w:jc w:val="center"/>
+        </w:trPr>
+        <w:tc>
+          <w:tcPr>
+            <w:tcW w:w="4320" w:type="dxa"/>
+          </w:tcPr>
+          <w:p>
+            <w:pPr>
+              <w:rPr>
+                <w:rFonts w:cstheme="minorHAnsi"/>
+              </w:rPr>
+            </w:pPr>
+            <w:r>
+              <w:rPr>
+                <w:rFonts w:cstheme="minorHAnsi"/>
+              </w:rPr>
+              <w:t>likes</w:t>
+            </w:r>
+          </w:p>
+        </w:tc>
+        <w:tc>
+          <w:tcPr>
+            <w:tcW w:w="4320" w:type="dxa"/>
+          </w:tcPr>
+          <w:p>
+            <w:pPr>
+              <w:rPr>
+                <w:rFonts w:cstheme="minorHAnsi"/>
+              </w:rPr>
+            </w:pPr>
+            <w:r>
+              <w:rPr>
+                <w:rFonts w:cstheme="minorHAnsi"/>
+              </w:rPr>
+              <w:t xml:space="preserve">Array of </w:t>
+            </w:r>
+            <w:proofErr w:type="spellStart"/>
+            <w:r>
+              <w:rPr>
+                <w:rFonts w:cstheme="minorHAnsi"/>
+              </w:rPr>
+              <w:t>ObjectIds</w:t>
+            </w:r>
+            <w:proofErr w:type="spellEnd"/>
+          </w:p>
+        </w:tc>
+      </w:tr>
+      <w:tr>
+        <w:trPr>
+          <w:jc w:val="center"/>
+        </w:trPr>
+        <w:tc>
+          <w:tcPr>
+            <w:tcW w:w="4320" w:type="dxa"/>
+          </w:tcPr>
+          <w:p>
+            <w:pPr>
+              <w:rPr>
+                <w:rFonts w:cstheme="minorHAnsi"/>
+              </w:rPr>
+            </w:pPr>
+            <w:proofErr w:type="spellStart"/>
+            <w:r>
+              <w:rPr>
+                <w:rFonts w:cstheme="minorHAnsi"/>
+              </w:rPr>
+              <w:t>createdAt</w:t>
+            </w:r>
+            <w:proofErr w:type="spellEnd"/>
+          </w:p>
+        </w:tc>
+        <w:tc>
+          <w:tcPr>
+            <w:tcW w:w="4320" w:type="dxa"/>
+          </w:tcPr>
+          <w:p>
+            <w:pPr>
+              <w:rPr>
+                <w:rFonts w:cstheme="minorHAnsi"/>
+              </w:rPr>
+            </w:pPr>
+            <w:r>
+              <w:rPr>
+                <w:rFonts w:cstheme="minorHAnsi"/>
+              </w:rPr>
+              <w:t>Date</w:t>
+            </w:r>
+          </w:p>
+        </w:tc>
+      </w:tr>
+    </w:tbl>
+    <w:p>
+      <w:pPr>
+        <w:rPr>
+          <w:rFonts w:cstheme="minorHAnsi"/>
+          <w:lang w:val="en-IN"/>
+        </w:rPr>
+      </w:pPr>
+    </w:p>
+    <w:p>
+      <w:pPr>
+        <w:rPr>
+          <w:rFonts w:cstheme="minorHAnsi"/>
           <w:b/>
           <w:bCs/>
           <w:sz w:val="24"/>
@@ -1666,6 +2882,7 @@
       </w:pPr>
       <w:r>
         <w:rPr>
+          <w:rFonts w:cstheme="minorHAnsi"/>
           <w:b/>
           <w:bCs/>
           <w:sz w:val="24"/>
@@ -1675,140 +2892,390 @@
         <w:t>6.3 Comment Collection</w:t>
       </w:r>
     </w:p>
-    <w:p>
-      <w:pPr>
-        <w:rPr>
-          <w:lang w:val="en-IN"/>
-        </w:rPr>
-      </w:pPr>
-      <w:r>
-        <w:rPr>
-          <w:lang w:val="en-IN"/>
-        </w:rPr>
-        <w:t xml:space="preserve">_id: </w:t>
-      </w:r>
-      <w:proofErr w:type="spellStart"/>
-      <w:r>
-        <w:rPr>
-          <w:lang w:val="en-IN"/>
-        </w:rPr>
-        <w:t>ObjectId</w:t>
-      </w:r>
-      <w:proofErr w:type="spellEnd"/>
-      <w:r>
-        <w:rPr>
-          <w:lang w:val="en-IN"/>
-        </w:rPr>
-        <w:br/>
-      </w:r>
-      <w:proofErr w:type="spellStart"/>
-      <w:r>
-        <w:rPr>
-          <w:lang w:val="en-IN"/>
-        </w:rPr>
-        <w:t>post_id</w:t>
-      </w:r>
-      <w:proofErr w:type="spellEnd"/>
-      <w:r>
-        <w:rPr>
-          <w:lang w:val="en-IN"/>
-        </w:rPr>
-        <w:t xml:space="preserve">: </w:t>
-      </w:r>
-      <w:proofErr w:type="spellStart"/>
-      <w:r>
-        <w:rPr>
-          <w:lang w:val="en-IN"/>
-        </w:rPr>
-        <w:t>ObjectId</w:t>
-      </w:r>
-      <w:proofErr w:type="spellEnd"/>
-      <w:r>
-        <w:rPr>
-          <w:lang w:val="en-IN"/>
-        </w:rPr>
-        <w:t xml:space="preserve"> (Reference to Post)</w:t>
-      </w:r>
-      <w:r>
-        <w:rPr>
-          <w:lang w:val="en-IN"/>
-        </w:rPr>
-        <w:br/>
-      </w:r>
-      <w:proofErr w:type="spellStart"/>
-      <w:r>
-        <w:rPr>
-          <w:lang w:val="en-IN"/>
-        </w:rPr>
-        <w:t>author_id</w:t>
-      </w:r>
-      <w:proofErr w:type="spellEnd"/>
-      <w:r>
-        <w:rPr>
-          <w:lang w:val="en-IN"/>
-        </w:rPr>
-        <w:t xml:space="preserve">: </w:t>
-      </w:r>
-      <w:proofErr w:type="spellStart"/>
-      <w:r>
-        <w:rPr>
-          <w:lang w:val="en-IN"/>
-        </w:rPr>
-        <w:t>ObjectId</w:t>
-      </w:r>
-      <w:proofErr w:type="spellEnd"/>
-      <w:r>
-        <w:rPr>
-          <w:lang w:val="en-IN"/>
-        </w:rPr>
-        <w:t xml:space="preserve"> (Reference to User)</w:t>
-      </w:r>
-      <w:r>
-        <w:rPr>
-          <w:lang w:val="en-IN"/>
-        </w:rPr>
-        <w:br/>
-        <w:t>content: String</w:t>
-      </w:r>
-      <w:r>
-        <w:rPr>
-          <w:lang w:val="en-IN"/>
-        </w:rPr>
-        <w:br/>
-      </w:r>
-      <w:proofErr w:type="spellStart"/>
-      <w:r>
-        <w:rPr>
-          <w:lang w:val="en-IN"/>
-        </w:rPr>
-        <w:t>createdAt</w:t>
-      </w:r>
-      <w:proofErr w:type="spellEnd"/>
-      <w:r>
-        <w:rPr>
-          <w:lang w:val="en-IN"/>
-        </w:rPr>
-        <w:t>: Date</w:t>
-      </w:r>
-    </w:p>
-    <w:p>
-      <w:pPr>
-        <w:rPr>
-          <w:lang w:val="en-IN"/>
-        </w:rPr>
-      </w:pPr>
-      <w:r>
-        <w:rPr>
-          <w:lang w:val="en-IN"/>
-        </w:rPr>
-        <w:pict w14:anchorId="7737DD80">
-          <v:rect id="_x0000_i1041" style="width:0;height:1.5pt" o:hralign="center" o:hrstd="t" o:hr="t" fillcolor="#a0a0a0" stroked="f"/>
-        </w:pict>
-      </w:r>
-    </w:p>
-    <w:p>
-      <w:pPr>
-        <w:rPr>
+    <w:tbl>
+      <w:tblPr>
+        <w:tblStyle w:val="TableGrid"/>
+        <w:tblW w:w="0" w:type="auto"/>
+        <w:jc w:val="center"/>
+        <w:tblLook w:val="04A0" w:firstRow="1" w:lastRow="0" w:firstColumn="1" w:lastColumn="0" w:noHBand="0" w:noVBand="1"/>
+      </w:tblPr>
+      <w:tblGrid>
+        <w:gridCol w:w="4320"/>
+        <w:gridCol w:w="4320"/>
+      </w:tblGrid>
+      <w:tr>
+        <w:trPr>
+          <w:jc w:val="center"/>
+        </w:trPr>
+        <w:tc>
+          <w:tcPr>
+            <w:tcW w:w="4320" w:type="dxa"/>
+          </w:tcPr>
+          <w:p>
+            <w:pPr>
+              <w:rPr>
+                <w:rFonts w:cstheme="minorHAnsi"/>
+                <w:b/>
+                <w:bCs/>
+              </w:rPr>
+            </w:pPr>
+            <w:r>
+              <w:rPr>
+                <w:rFonts w:cstheme="minorHAnsi"/>
+                <w:b/>
+                <w:bCs/>
+              </w:rPr>
+              <w:t>Field Name</w:t>
+            </w:r>
+          </w:p>
+        </w:tc>
+        <w:tc>
+          <w:tcPr>
+            <w:tcW w:w="4320" w:type="dxa"/>
+          </w:tcPr>
+          <w:p>
+            <w:pPr>
+              <w:rPr>
+                <w:rFonts w:cstheme="minorHAnsi"/>
+                <w:b/>
+                <w:bCs/>
+              </w:rPr>
+            </w:pPr>
+            <w:r>
+              <w:rPr>
+                <w:rFonts w:cstheme="minorHAnsi"/>
+                <w:b/>
+                <w:bCs/>
+              </w:rPr>
+              <w:t>Data Type / Description</w:t>
+            </w:r>
+          </w:p>
+        </w:tc>
+      </w:tr>
+      <w:tr>
+        <w:trPr>
+          <w:jc w:val="center"/>
+        </w:trPr>
+        <w:tc>
+          <w:tcPr>
+            <w:tcW w:w="4320" w:type="dxa"/>
+          </w:tcPr>
+          <w:p>
+            <w:pPr>
+              <w:rPr>
+                <w:rFonts w:cstheme="minorHAnsi"/>
+              </w:rPr>
+            </w:pPr>
+            <w:r>
+              <w:rPr>
+                <w:rFonts w:cstheme="minorHAnsi"/>
+              </w:rPr>
+              <w:t>_id</w:t>
+            </w:r>
+          </w:p>
+        </w:tc>
+        <w:tc>
+          <w:tcPr>
+            <w:tcW w:w="4320" w:type="dxa"/>
+          </w:tcPr>
+          <w:p>
+            <w:pPr>
+              <w:rPr>
+                <w:rFonts w:cstheme="minorHAnsi"/>
+              </w:rPr>
+            </w:pPr>
+            <w:proofErr w:type="spellStart"/>
+            <w:r>
+              <w:rPr>
+                <w:rFonts w:cstheme="minorHAnsi"/>
+              </w:rPr>
+              <w:t>ObjectId</w:t>
+            </w:r>
+            <w:proofErr w:type="spellEnd"/>
+          </w:p>
+        </w:tc>
+      </w:tr>
+      <w:tr>
+        <w:trPr>
+          <w:jc w:val="center"/>
+        </w:trPr>
+        <w:tc>
+          <w:tcPr>
+            <w:tcW w:w="4320" w:type="dxa"/>
+          </w:tcPr>
+          <w:p>
+            <w:pPr>
+              <w:rPr>
+                <w:rFonts w:cstheme="minorHAnsi"/>
+              </w:rPr>
+            </w:pPr>
+            <w:proofErr w:type="spellStart"/>
+            <w:r>
+              <w:rPr>
+                <w:rFonts w:cstheme="minorHAnsi"/>
+              </w:rPr>
+              <w:t>author_id</w:t>
+            </w:r>
+            <w:proofErr w:type="spellEnd"/>
+          </w:p>
+        </w:tc>
+        <w:tc>
+          <w:tcPr>
+            <w:tcW w:w="4320" w:type="dxa"/>
+          </w:tcPr>
+          <w:p>
+            <w:pPr>
+              <w:rPr>
+                <w:rFonts w:cstheme="minorHAnsi"/>
+              </w:rPr>
+            </w:pPr>
+            <w:proofErr w:type="spellStart"/>
+            <w:r>
+              <w:rPr>
+                <w:rFonts w:cstheme="minorHAnsi"/>
+              </w:rPr>
+              <w:t>ObjectId</w:t>
+            </w:r>
+            <w:proofErr w:type="spellEnd"/>
+            <w:r>
+              <w:rPr>
+                <w:rFonts w:cstheme="minorHAnsi"/>
+              </w:rPr>
+              <w:t xml:space="preserve"> (Ref User)</w:t>
+            </w:r>
+          </w:p>
+        </w:tc>
+      </w:tr>
+      <w:tr>
+        <w:trPr>
+          <w:jc w:val="center"/>
+        </w:trPr>
+        <w:tc>
+          <w:tcPr>
+            <w:tcW w:w="4320" w:type="dxa"/>
+          </w:tcPr>
+          <w:p>
+            <w:pPr>
+              <w:rPr>
+                <w:rFonts w:cstheme="minorHAnsi"/>
+              </w:rPr>
+            </w:pPr>
+            <w:r>
+              <w:rPr>
+                <w:rFonts w:cstheme="minorHAnsi"/>
+              </w:rPr>
+              <w:t>content</w:t>
+            </w:r>
+          </w:p>
+        </w:tc>
+        <w:tc>
+          <w:tcPr>
+            <w:tcW w:w="4320" w:type="dxa"/>
+          </w:tcPr>
+          <w:p>
+            <w:pPr>
+              <w:rPr>
+                <w:rFonts w:cstheme="minorHAnsi"/>
+              </w:rPr>
+            </w:pPr>
+            <w:r>
+              <w:rPr>
+                <w:rFonts w:cstheme="minorHAnsi"/>
+              </w:rPr>
+              <w:t>String</w:t>
+            </w:r>
+          </w:p>
+        </w:tc>
+      </w:tr>
+      <w:tr>
+        <w:trPr>
+          <w:jc w:val="center"/>
+        </w:trPr>
+        <w:tc>
+          <w:tcPr>
+            <w:tcW w:w="4320" w:type="dxa"/>
+          </w:tcPr>
+          <w:p>
+            <w:pPr>
+              <w:rPr>
+                <w:rFonts w:cstheme="minorHAnsi"/>
+              </w:rPr>
+            </w:pPr>
+            <w:proofErr w:type="spellStart"/>
+            <w:r>
+              <w:rPr>
+                <w:rFonts w:cstheme="minorHAnsi"/>
+              </w:rPr>
+              <w:t>isAnonymous</w:t>
+            </w:r>
+            <w:proofErr w:type="spellEnd"/>
+          </w:p>
+        </w:tc>
+        <w:tc>
+          <w:tcPr>
+            <w:tcW w:w="4320" w:type="dxa"/>
+          </w:tcPr>
+          <w:p>
+            <w:pPr>
+              <w:rPr>
+                <w:rFonts w:cstheme="minorHAnsi"/>
+              </w:rPr>
+            </w:pPr>
+            <w:r>
+              <w:rPr>
+                <w:rFonts w:cstheme="minorHAnsi"/>
+              </w:rPr>
+              <w:t>Boolean (default: false)</w:t>
+            </w:r>
+          </w:p>
+        </w:tc>
+      </w:tr>
+      <w:tr>
+        <w:trPr>
+          <w:jc w:val="center"/>
+        </w:trPr>
+        <w:tc>
+          <w:tcPr>
+            <w:tcW w:w="4320" w:type="dxa"/>
+          </w:tcPr>
+          <w:p>
+            <w:pPr>
+              <w:rPr>
+                <w:rFonts w:cstheme="minorHAnsi"/>
+              </w:rPr>
+            </w:pPr>
+            <w:r>
+              <w:rPr>
+                <w:rFonts w:cstheme="minorHAnsi"/>
+              </w:rPr>
+              <w:t>topic</w:t>
+            </w:r>
+          </w:p>
+        </w:tc>
+        <w:tc>
+          <w:tcPr>
+            <w:tcW w:w="4320" w:type="dxa"/>
+          </w:tcPr>
+          <w:p>
+            <w:pPr>
+              <w:rPr>
+                <w:rFonts w:cstheme="minorHAnsi"/>
+              </w:rPr>
+            </w:pPr>
+            <w:r>
+              <w:rPr>
+                <w:rFonts w:cstheme="minorHAnsi"/>
+              </w:rPr>
+              <w:t>String</w:t>
+            </w:r>
+          </w:p>
+        </w:tc>
+      </w:tr>
+      <w:tr>
+        <w:trPr>
+          <w:jc w:val="center"/>
+        </w:trPr>
+        <w:tc>
+          <w:tcPr>
+            <w:tcW w:w="4320" w:type="dxa"/>
+          </w:tcPr>
+          <w:p>
+            <w:pPr>
+              <w:rPr>
+                <w:rFonts w:cstheme="minorHAnsi"/>
+              </w:rPr>
+            </w:pPr>
+            <w:r>
+              <w:rPr>
+                <w:rFonts w:cstheme="minorHAnsi"/>
+              </w:rPr>
+              <w:t>likes</w:t>
+            </w:r>
+          </w:p>
+        </w:tc>
+        <w:tc>
+          <w:tcPr>
+            <w:tcW w:w="4320" w:type="dxa"/>
+          </w:tcPr>
+          <w:p>
+            <w:pPr>
+              <w:rPr>
+                <w:rFonts w:cstheme="minorHAnsi"/>
+              </w:rPr>
+            </w:pPr>
+            <w:r>
+              <w:rPr>
+                <w:rFonts w:cstheme="minorHAnsi"/>
+              </w:rPr>
+              <w:t xml:space="preserve">Array of </w:t>
+            </w:r>
+            <w:proofErr w:type="spellStart"/>
+            <w:r>
+              <w:rPr>
+                <w:rFonts w:cstheme="minorHAnsi"/>
+              </w:rPr>
+              <w:t>ObjectIds</w:t>
+            </w:r>
+            <w:proofErr w:type="spellEnd"/>
+          </w:p>
+        </w:tc>
+      </w:tr>
+      <w:tr>
+        <w:trPr>
+          <w:jc w:val="center"/>
+        </w:trPr>
+        <w:tc>
+          <w:tcPr>
+            <w:tcW w:w="4320" w:type="dxa"/>
+          </w:tcPr>
+          <w:p>
+            <w:pPr>
+              <w:rPr>
+                <w:rFonts w:cstheme="minorHAnsi"/>
+              </w:rPr>
+            </w:pPr>
+            <w:proofErr w:type="spellStart"/>
+            <w:r>
+              <w:rPr>
+                <w:rFonts w:cstheme="minorHAnsi"/>
+              </w:rPr>
+              <w:t>createdAt</w:t>
+            </w:r>
+            <w:proofErr w:type="spellEnd"/>
+          </w:p>
+        </w:tc>
+        <w:tc>
+          <w:tcPr>
+            <w:tcW w:w="4320" w:type="dxa"/>
+          </w:tcPr>
+          <w:p>
+            <w:pPr>
+              <w:rPr>
+                <w:rFonts w:cstheme="minorHAnsi"/>
+              </w:rPr>
+            </w:pPr>
+            <w:r>
+              <w:rPr>
+                <w:rFonts w:cstheme="minorHAnsi"/>
+              </w:rPr>
+              <w:t>Date</w:t>
+            </w:r>
+          </w:p>
+        </w:tc>
+      </w:tr>
+    </w:tbl>
+    <w:p>
+      <w:pPr>
+        <w:rPr>
+          <w:rFonts w:cstheme="minorHAnsi"/>
+          <w:lang w:val="en-IN"/>
+        </w:rPr>
+      </w:pPr>
+    </w:p>
+    <w:p>
+      <w:pPr>
+        <w:rPr>
+          <w:rFonts w:cstheme="minorHAnsi"/>
           <w:b/>
           <w:bCs/>
           <w:sz w:val="24"/>
@@ -1818,6 +3285,7 @@
       </w:pPr>
       <w:r>
         <w:rPr>
+          <w:rFonts w:cstheme="minorHAnsi"/>
           <w:b/>
           <w:bCs/>
           <w:sz w:val="24"/>
@@ -1829,6 +3297,7 @@
       <w:proofErr w:type="spellStart"/>
       <w:r>
         <w:rPr>
+          <w:rFonts w:cstheme="minorHAnsi"/>
           <w:b/>
           <w:bCs/>
           <w:sz w:val="24"/>
@@ -1840,6 +3309,7 @@
       <w:proofErr w:type="spellEnd"/>
       <w:r>
         <w:rPr>
+          <w:rFonts w:cstheme="minorHAnsi"/>
           <w:b/>
           <w:bCs/>
           <w:sz w:val="24"/>
@@ -1849,137 +3319,226 @@
         <w:t xml:space="preserve"> Collection</w:t>
       </w:r>
     </w:p>
-    <w:p>
-      <w:pPr>
-        <w:rPr>
-          <w:lang w:val="en-IN"/>
-        </w:rPr>
-      </w:pPr>
-      <w:r>
-        <w:rPr>
-          <w:lang w:val="en-IN"/>
-        </w:rPr>
-        <w:t xml:space="preserve">_id: </w:t>
-      </w:r>
-      <w:proofErr w:type="spellStart"/>
-      <w:r>
-        <w:rPr>
-          <w:lang w:val="en-IN"/>
-        </w:rPr>
-        <w:t>ObjectId</w:t>
-      </w:r>
-      <w:proofErr w:type="spellEnd"/>
-      <w:r>
-        <w:rPr>
-          <w:lang w:val="en-IN"/>
-        </w:rPr>
-        <w:br/>
-      </w:r>
-      <w:proofErr w:type="spellStart"/>
-      <w:r>
-        <w:rPr>
-          <w:lang w:val="en-IN"/>
-        </w:rPr>
-        <w:t>user_id</w:t>
-      </w:r>
-      <w:proofErr w:type="spellEnd"/>
-      <w:r>
-        <w:rPr>
-          <w:lang w:val="en-IN"/>
-        </w:rPr>
-        <w:t xml:space="preserve">: </w:t>
-      </w:r>
-      <w:proofErr w:type="spellStart"/>
-      <w:r>
-        <w:rPr>
-          <w:lang w:val="en-IN"/>
-        </w:rPr>
-        <w:t>ObjectId</w:t>
-      </w:r>
-      <w:proofErr w:type="spellEnd"/>
-      <w:r>
-        <w:rPr>
-          <w:lang w:val="en-IN"/>
-        </w:rPr>
-        <w:t xml:space="preserve"> (Reference to User)</w:t>
-      </w:r>
-      <w:r>
-        <w:rPr>
-          <w:lang w:val="en-IN"/>
-        </w:rPr>
-        <w:br/>
-        <w:t>messages: Array of objects containing:</w:t>
-      </w:r>
-    </w:p>
-    <w:p>
-      <w:pPr>
-        <w:numPr>
-          <w:ilvl w:val="0"/>
-          <w:numId w:val="2"/>
-        </w:numPr>
-        <w:rPr>
-          <w:lang w:val="en-IN"/>
-        </w:rPr>
-      </w:pPr>
-      <w:r>
-        <w:rPr>
-          <w:lang w:val="en-IN"/>
-        </w:rPr>
-        <w:t xml:space="preserve">role (user or model) </w:t>
-      </w:r>
-    </w:p>
-    <w:p>
-      <w:pPr>
-        <w:numPr>
-          <w:ilvl w:val="0"/>
-          <w:numId w:val="2"/>
-        </w:numPr>
-        <w:rPr>
-          <w:lang w:val="en-IN"/>
-        </w:rPr>
-      </w:pPr>
-      <w:r>
-        <w:rPr>
-          <w:lang w:val="en-IN"/>
-        </w:rPr>
-        <w:t xml:space="preserve">text </w:t>
-      </w:r>
-    </w:p>
-    <w:p>
-      <w:pPr>
-        <w:numPr>
-          <w:ilvl w:val="0"/>
-          <w:numId w:val="2"/>
-        </w:numPr>
-        <w:rPr>
-          <w:lang w:val="en-IN"/>
-        </w:rPr>
-      </w:pPr>
-      <w:r>
-        <w:rPr>
-          <w:lang w:val="en-IN"/>
-        </w:rPr>
-        <w:t>timestamp</w:t>
-      </w:r>
-    </w:p>
-    <w:p>
-      <w:pPr>
-        <w:rPr>
-          <w:lang w:val="en-IN"/>
-        </w:rPr>
-      </w:pPr>
-      <w:r>
-        <w:rPr>
-          <w:lang w:val="en-IN"/>
-        </w:rPr>
-        <w:pict w14:anchorId="35396978">
-          <v:rect id="_x0000_i1042" style="width:0;height:1.5pt" o:hralign="center" o:hrstd="t" o:hr="t" fillcolor="#a0a0a0" stroked="f"/>
-        </w:pict>
-      </w:r>
-    </w:p>
-    <w:p>
-      <w:pPr>
-        <w:rPr>
+    <w:tbl>
+      <w:tblPr>
+        <w:tblStyle w:val="TableGrid"/>
+        <w:tblW w:w="0" w:type="auto"/>
+        <w:jc w:val="center"/>
+        <w:tblLook w:val="04A0" w:firstRow="1" w:lastRow="0" w:firstColumn="1" w:lastColumn="0" w:noHBand="0" w:noVBand="1"/>
+      </w:tblPr>
+      <w:tblGrid>
+        <w:gridCol w:w="4320"/>
+        <w:gridCol w:w="4320"/>
+      </w:tblGrid>
+      <w:tr>
+        <w:trPr>
+          <w:jc w:val="center"/>
+        </w:trPr>
+        <w:tc>
+          <w:tcPr>
+            <w:tcW w:w="4320" w:type="dxa"/>
+          </w:tcPr>
+          <w:p>
+            <w:pPr>
+              <w:rPr>
+                <w:rFonts w:cstheme="minorHAnsi"/>
+                <w:b/>
+                <w:bCs/>
+              </w:rPr>
+            </w:pPr>
+            <w:r>
+              <w:rPr>
+                <w:rFonts w:cstheme="minorHAnsi"/>
+                <w:b/>
+                <w:bCs/>
+              </w:rPr>
+              <w:t>Field Name</w:t>
+            </w:r>
+          </w:p>
+        </w:tc>
+        <w:tc>
+          <w:tcPr>
+            <w:tcW w:w="4320" w:type="dxa"/>
+          </w:tcPr>
+          <w:p>
+            <w:pPr>
+              <w:rPr>
+                <w:rFonts w:cstheme="minorHAnsi"/>
+                <w:b/>
+                <w:bCs/>
+              </w:rPr>
+            </w:pPr>
+            <w:r>
+              <w:rPr>
+                <w:rFonts w:cstheme="minorHAnsi"/>
+                <w:b/>
+                <w:bCs/>
+              </w:rPr>
+              <w:t>Data Type / Description</w:t>
+            </w:r>
+          </w:p>
+        </w:tc>
+      </w:tr>
+      <w:tr>
+        <w:trPr>
+          <w:jc w:val="center"/>
+        </w:trPr>
+        <w:tc>
+          <w:tcPr>
+            <w:tcW w:w="4320" w:type="dxa"/>
+          </w:tcPr>
+          <w:p>
+            <w:pPr>
+              <w:rPr>
+                <w:rFonts w:cstheme="minorHAnsi"/>
+              </w:rPr>
+            </w:pPr>
+            <w:r>
+              <w:rPr>
+                <w:rFonts w:cstheme="minorHAnsi"/>
+              </w:rPr>
+              <w:t>_id</w:t>
+            </w:r>
+          </w:p>
+        </w:tc>
+        <w:tc>
+          <w:tcPr>
+            <w:tcW w:w="4320" w:type="dxa"/>
+          </w:tcPr>
+          <w:p>
+            <w:pPr>
+              <w:rPr>
+                <w:rFonts w:cstheme="minorHAnsi"/>
+              </w:rPr>
+            </w:pPr>
+            <w:proofErr w:type="spellStart"/>
+            <w:r>
+              <w:rPr>
+                <w:rFonts w:cstheme="minorHAnsi"/>
+              </w:rPr>
+              <w:t>ObjectId</w:t>
+            </w:r>
+            <w:proofErr w:type="spellEnd"/>
+          </w:p>
+        </w:tc>
+      </w:tr>
+      <w:tr>
+        <w:trPr>
+          <w:jc w:val="center"/>
+        </w:trPr>
+        <w:tc>
+          <w:tcPr>
+            <w:tcW w:w="4320" w:type="dxa"/>
+          </w:tcPr>
+          <w:p>
+            <w:pPr>
+              <w:rPr>
+                <w:rFonts w:cstheme="minorHAnsi"/>
+              </w:rPr>
+            </w:pPr>
+            <w:proofErr w:type="spellStart"/>
+            <w:r>
+              <w:rPr>
+                <w:rFonts w:cstheme="minorHAnsi"/>
+              </w:rPr>
+              <w:t>user_id</w:t>
+            </w:r>
+            <w:proofErr w:type="spellEnd"/>
+          </w:p>
+        </w:tc>
+        <w:tc>
+          <w:tcPr>
+            <w:tcW w:w="4320" w:type="dxa"/>
+          </w:tcPr>
+          <w:p>
+            <w:pPr>
+              <w:rPr>
+                <w:rFonts w:cstheme="minorHAnsi"/>
+              </w:rPr>
+            </w:pPr>
+            <w:proofErr w:type="spellStart"/>
+            <w:r>
+              <w:rPr>
+                <w:rFonts w:cstheme="minorHAnsi"/>
+              </w:rPr>
+              <w:t>ObjectId</w:t>
+            </w:r>
+            <w:proofErr w:type="spellEnd"/>
+            <w:r>
+              <w:rPr>
+                <w:rFonts w:cstheme="minorHAnsi"/>
+              </w:rPr>
+              <w:t xml:space="preserve"> (Ref User)</w:t>
+            </w:r>
+          </w:p>
+        </w:tc>
+      </w:tr>
+      <w:tr>
+        <w:trPr>
+          <w:jc w:val="center"/>
+        </w:trPr>
+        <w:tc>
+          <w:tcPr>
+            <w:tcW w:w="4320" w:type="dxa"/>
+          </w:tcPr>
+          <w:p>
+            <w:pPr>
+              <w:rPr>
+                <w:rFonts w:cstheme="minorHAnsi"/>
+              </w:rPr>
+            </w:pPr>
+            <w:r>
+              <w:rPr>
+                <w:rFonts w:cstheme="minorHAnsi"/>
+              </w:rPr>
+              <w:t>messages</w:t>
+            </w:r>
+          </w:p>
+        </w:tc>
+        <w:tc>
+          <w:tcPr>
+            <w:tcW w:w="4320" w:type="dxa"/>
+          </w:tcPr>
+          <w:p>
+            <w:pPr>
+              <w:rPr>
+                <w:rFonts w:cstheme="minorHAnsi"/>
+              </w:rPr>
+            </w:pPr>
+            <w:r>
+              <w:rPr>
+                <w:rFonts w:cstheme="minorHAnsi"/>
+              </w:rPr>
+              <w:t>Array of Objects {role, text, timestamp}</w:t>
+            </w:r>
+          </w:p>
+        </w:tc>
+      </w:tr>
+    </w:tbl>
+    <w:p>
+      <w:pPr>
+        <w:rPr>
+          <w:rFonts w:cstheme="minorHAnsi"/>
+          <w:b/>
+          <w:bCs/>
+          <w:sz w:val="24"/>
+          <w:szCs w:val="24"/>
+          <w:lang w:val="en-IN"/>
+        </w:rPr>
+      </w:pPr>
+    </w:p>
+    <w:p>
+      <w:pPr>
+        <w:rPr>
+          <w:rFonts w:cstheme="minorHAnsi"/>
+          <w:lang w:val="en-IN"/>
+        </w:rPr>
+      </w:pPr>
+    </w:p>
+    <w:p>
+      <w:pPr>
+        <w:rPr>
+          <w:rFonts w:cstheme="minorHAnsi"/>
           <w:b/>
           <w:bCs/>
           <w:sz w:val="28"/>
@@ -1987,14 +3546,27 @@
           <w:lang w:val="en-IN"/>
         </w:rPr>
       </w:pPr>
-      <w:r>
-        <w:rPr>
+    </w:p>
+    <w:p>
+      <w:pPr>
+        <w:rPr>
+          <w:rFonts w:cstheme="minorHAnsi"/>
           <w:b/>
           <w:bCs/>
           <w:sz w:val="28"/>
           <w:szCs w:val="28"/>
           <w:lang w:val="en-IN"/>
         </w:rPr>
+      </w:pPr>
+      <w:r>
+        <w:rPr>
+          <w:rFonts w:cstheme="minorHAnsi"/>
+          <w:b/>
+          <w:bCs/>
+          <w:sz w:val="28"/>
+          <w:szCs w:val="28"/>
+          <w:lang w:val="en-IN"/>
+        </w:rPr>
         <w:lastRenderedPageBreak/>
         <w:t>7. UI/UX Design Specifications</w:t>
       </w:r>
@@ -2002,6 +3574,7 @@
     <w:p>
       <w:pPr>
         <w:rPr>
+          <w:rFonts w:cstheme="minorHAnsi"/>
           <w:b/>
           <w:bCs/>
           <w:sz w:val="24"/>
@@ -2011,6 +3584,7 @@
       </w:pPr>
       <w:r>
         <w:rPr>
+          <w:rFonts w:cstheme="minorHAnsi"/>
           <w:b/>
           <w:bCs/>
           <w:sz w:val="24"/>
@@ -2023,11 +3597,13 @@
     <w:p>
       <w:pPr>
         <w:rPr>
-          <w:lang w:val="en-IN"/>
-        </w:rPr>
-      </w:pPr>
-      <w:r>
-        <w:rPr>
+          <w:rFonts w:cstheme="minorHAnsi"/>
+          <w:lang w:val="en-IN"/>
+        </w:rPr>
+      </w:pPr>
+      <w:r>
+        <w:rPr>
+          <w:rFonts w:cstheme="minorHAnsi"/>
           <w:b/>
           <w:bCs/>
           <w:lang w:val="en-IN"/>
@@ -2036,6 +3612,7 @@
       </w:r>
       <w:r>
         <w:rPr>
+          <w:rFonts w:cstheme="minorHAnsi"/>
           <w:lang w:val="en-IN"/>
         </w:rPr>
         <w:br/>
@@ -2044,6 +3621,7 @@
       <w:proofErr w:type="spellStart"/>
       <w:r>
         <w:rPr>
+          <w:rFonts w:cstheme="minorHAnsi"/>
           <w:lang w:val="en-IN"/>
         </w:rPr>
         <w:t>Defense</w:t>
@@ -2053,13 +3631,15 @@
     <w:p>
       <w:pPr>
         <w:rPr>
-          <w:b/>
-          <w:bCs/>
-          <w:lang w:val="en-IN"/>
-        </w:rPr>
-      </w:pPr>
-      <w:r>
-        <w:rPr>
+          <w:rFonts w:cstheme="minorHAnsi"/>
+          <w:b/>
+          <w:bCs/>
+          <w:lang w:val="en-IN"/>
+        </w:rPr>
+      </w:pPr>
+      <w:r>
+        <w:rPr>
+          <w:rFonts w:cstheme="minorHAnsi"/>
           <w:b/>
           <w:bCs/>
           <w:lang w:val="en-IN"/>
@@ -2070,11 +3650,13 @@
     <w:p>
       <w:pPr>
         <w:rPr>
-          <w:lang w:val="en-IN"/>
-        </w:rPr>
-      </w:pPr>
-      <w:r>
-        <w:rPr>
+          <w:rFonts w:cstheme="minorHAnsi"/>
+          <w:lang w:val="en-IN"/>
+        </w:rPr>
+      </w:pPr>
+      <w:r>
+        <w:rPr>
+          <w:rFonts w:cstheme="minorHAnsi"/>
           <w:b/>
           <w:bCs/>
           <w:lang w:val="en-IN"/>
@@ -2083,6 +3665,7 @@
       </w:r>
       <w:r>
         <w:rPr>
+          <w:rFonts w:cstheme="minorHAnsi"/>
           <w:b/>
           <w:bCs/>
           <w:lang w:val="en-IN"/>
@@ -2091,6 +3674,7 @@
       </w:r>
       <w:r>
         <w:rPr>
+          <w:rFonts w:cstheme="minorHAnsi"/>
           <w:lang w:val="en-IN"/>
         </w:rPr>
         <w:t>A text input area with an anonymous toggle and post button</w:t>
@@ -2099,11 +3683,13 @@
     <w:p>
       <w:pPr>
         <w:rPr>
-          <w:lang w:val="en-IN"/>
-        </w:rPr>
-      </w:pPr>
-      <w:r>
-        <w:rPr>
+          <w:rFonts w:cstheme="minorHAnsi"/>
+          <w:lang w:val="en-IN"/>
+        </w:rPr>
+      </w:pPr>
+      <w:r>
+        <w:rPr>
+          <w:rFonts w:cstheme="minorHAnsi"/>
           <w:b/>
           <w:bCs/>
           <w:lang w:val="en-IN"/>
@@ -2112,6 +3698,7 @@
       </w:r>
       <w:r>
         <w:rPr>
+          <w:rFonts w:cstheme="minorHAnsi"/>
           <w:b/>
           <w:bCs/>
           <w:lang w:val="en-IN"/>
@@ -2120,6 +3707,7 @@
       </w:r>
       <w:r>
         <w:rPr>
+          <w:rFonts w:cstheme="minorHAnsi"/>
           <w:lang w:val="en-IN"/>
         </w:rPr>
         <w:t>Each post displays:</w:t>
@@ -2132,12 +3720,14 @@
           <w:numId w:val="3"/>
         </w:numPr>
         <w:rPr>
+          <w:rFonts w:cstheme="minorHAnsi"/>
           <w:lang w:val="en-IN"/>
         </w:rPr>
       </w:pPr>
       <w:proofErr w:type="gramStart"/>
       <w:r>
         <w:rPr>
+          <w:rFonts w:cstheme="minorHAnsi"/>
           <w:lang w:val="en-IN"/>
         </w:rPr>
         <w:t>User name</w:t>
@@ -2145,6 +3735,7 @@
       <w:proofErr w:type="gramEnd"/>
       <w:r>
         <w:rPr>
+          <w:rFonts w:cstheme="minorHAnsi"/>
           <w:lang w:val="en-IN"/>
         </w:rPr>
         <w:t xml:space="preserve"> or "Anonymous" </w:t>
@@ -2157,11 +3748,13 @@
           <w:numId w:val="3"/>
         </w:numPr>
         <w:rPr>
-          <w:lang w:val="en-IN"/>
-        </w:rPr>
-      </w:pPr>
-      <w:r>
-        <w:rPr>
+          <w:rFonts w:cstheme="minorHAnsi"/>
+          <w:lang w:val="en-IN"/>
+        </w:rPr>
+      </w:pPr>
+      <w:r>
+        <w:rPr>
+          <w:rFonts w:cstheme="minorHAnsi"/>
           <w:lang w:val="en-IN"/>
         </w:rPr>
         <w:t xml:space="preserve">Timestamp </w:t>
@@ -2174,11 +3767,13 @@
           <w:numId w:val="3"/>
         </w:numPr>
         <w:rPr>
-          <w:lang w:val="en-IN"/>
-        </w:rPr>
-      </w:pPr>
-      <w:r>
-        <w:rPr>
+          <w:rFonts w:cstheme="minorHAnsi"/>
+          <w:lang w:val="en-IN"/>
+        </w:rPr>
+      </w:pPr>
+      <w:r>
+        <w:rPr>
+          <w:rFonts w:cstheme="minorHAnsi"/>
           <w:lang w:val="en-IN"/>
         </w:rPr>
         <w:t xml:space="preserve">Post content </w:t>
@@ -2191,11 +3786,13 @@
           <w:numId w:val="3"/>
         </w:numPr>
         <w:rPr>
-          <w:lang w:val="en-IN"/>
-        </w:rPr>
-      </w:pPr>
-      <w:r>
-        <w:rPr>
+          <w:rFonts w:cstheme="minorHAnsi"/>
+          <w:lang w:val="en-IN"/>
+        </w:rPr>
+      </w:pPr>
+      <w:r>
+        <w:rPr>
+          <w:rFonts w:cstheme="minorHAnsi"/>
           <w:lang w:val="en-IN"/>
         </w:rPr>
         <w:t xml:space="preserve">Like and comment buttons </w:t>
@@ -2208,11 +3805,13 @@
           <w:numId w:val="3"/>
         </w:numPr>
         <w:rPr>
-          <w:lang w:val="en-IN"/>
-        </w:rPr>
-      </w:pPr>
-      <w:r>
-        <w:rPr>
+          <w:rFonts w:cstheme="minorHAnsi"/>
+          <w:lang w:val="en-IN"/>
+        </w:rPr>
+      </w:pPr>
+      <w:r>
+        <w:rPr>
+          <w:rFonts w:cstheme="minorHAnsi"/>
           <w:lang w:val="en-IN"/>
         </w:rPr>
         <w:t xml:space="preserve">Topic tag </w:t>
@@ -2221,11 +3820,13 @@
     <w:p>
       <w:pPr>
         <w:rPr>
-          <w:lang w:val="en-IN"/>
-        </w:rPr>
-      </w:pPr>
-      <w:r>
-        <w:rPr>
+          <w:rFonts w:cstheme="minorHAnsi"/>
+          <w:lang w:val="en-IN"/>
+        </w:rPr>
+      </w:pPr>
+      <w:r>
+        <w:rPr>
+          <w:rFonts w:cstheme="minorHAnsi"/>
           <w:b/>
           <w:bCs/>
           <w:lang w:val="en-IN"/>
@@ -2234,6 +3835,7 @@
       </w:r>
       <w:r>
         <w:rPr>
+          <w:rFonts w:cstheme="minorHAnsi"/>
           <w:lang w:val="en-IN"/>
         </w:rPr>
         <w:br/>
@@ -2243,11 +3845,13 @@
     <w:p>
       <w:pPr>
         <w:rPr>
-          <w:lang w:val="en-IN"/>
-        </w:rPr>
-      </w:pPr>
-      <w:r>
-        <w:rPr>
+          <w:rFonts w:cstheme="minorHAnsi"/>
+          <w:lang w:val="en-IN"/>
+        </w:rPr>
+      </w:pPr>
+      <w:r>
+        <w:rPr>
+          <w:rFonts w:cstheme="minorHAnsi"/>
           <w:lang w:val="en-IN"/>
         </w:rPr>
         <w:pict w14:anchorId="768FDEB5">
@@ -2258,6 +3862,7 @@
     <w:p>
       <w:pPr>
         <w:rPr>
+          <w:rFonts w:cstheme="minorHAnsi"/>
           <w:b/>
           <w:bCs/>
           <w:sz w:val="28"/>
@@ -2269,6 +3874,7 @@
     <w:p>
       <w:pPr>
         <w:rPr>
+          <w:rFonts w:cstheme="minorHAnsi"/>
           <w:b/>
           <w:bCs/>
           <w:sz w:val="28"/>
@@ -2278,6 +3884,7 @@
       </w:pPr>
       <w:r>
         <w:rPr>
+          <w:rFonts w:cstheme="minorHAnsi"/>
           <w:b/>
           <w:bCs/>
           <w:sz w:val="28"/>
@@ -2290,11 +3897,13 @@
     <w:p>
       <w:pPr>
         <w:rPr>
-          <w:lang w:val="en-IN"/>
-        </w:rPr>
-      </w:pPr>
-      <w:r>
-        <w:rPr>
+          <w:rFonts w:cstheme="minorHAnsi"/>
+          <w:lang w:val="en-IN"/>
+        </w:rPr>
+      </w:pPr>
+      <w:r>
+        <w:rPr>
+          <w:rFonts w:cstheme="minorHAnsi"/>
           <w:lang w:val="en-IN"/>
         </w:rPr>
         <w:t>23rd March: Project name updated with repository link</w:t>
@@ -2303,11 +3912,13 @@
     <w:p>
       <w:pPr>
         <w:rPr>
-          <w:lang w:val="en-IN"/>
-        </w:rPr>
-      </w:pPr>
-      <w:r>
-        <w:rPr>
+          <w:rFonts w:cstheme="minorHAnsi"/>
+          <w:lang w:val="en-IN"/>
+        </w:rPr>
+      </w:pPr>
+      <w:r>
+        <w:rPr>
+          <w:rFonts w:cstheme="minorHAnsi"/>
           <w:lang w:val="en-IN"/>
         </w:rPr>
         <w:t>26th March: Requirement and Design document uploaded</w:t>
@@ -2316,11 +3927,13 @@
     <w:p>
       <w:pPr>
         <w:rPr>
-          <w:lang w:val="en-IN"/>
-        </w:rPr>
-      </w:pPr>
-      <w:r>
-        <w:rPr>
+          <w:rFonts w:cstheme="minorHAnsi"/>
+          <w:lang w:val="en-IN"/>
+        </w:rPr>
+      </w:pPr>
+      <w:r>
+        <w:rPr>
+          <w:rFonts w:cstheme="minorHAnsi"/>
           <w:lang w:val="en-IN"/>
         </w:rPr>
         <w:t>26th March: README completed with full project details</w:t>
@@ -2329,29 +3942,34 @@
     <w:p>
       <w:pPr>
         <w:rPr>
-          <w:lang w:val="en-IN"/>
-        </w:rPr>
-      </w:pPr>
-      <w:r>
-        <w:rPr>
+          <w:rFonts w:cstheme="minorHAnsi"/>
+          <w:lang w:val="en-IN"/>
+        </w:rPr>
+      </w:pPr>
+      <w:r>
+        <w:rPr>
+          <w:rFonts w:cstheme="minorHAnsi"/>
           <w:lang w:val="en-IN"/>
         </w:rPr>
         <w:t xml:space="preserve">9th April (Final Deadline): Project </w:t>
       </w:r>
       <w:r>
         <w:rPr>
+          <w:rFonts w:cstheme="minorHAnsi"/>
           <w:lang w:val="en-IN"/>
         </w:rPr>
         <w:t xml:space="preserve">to be </w:t>
       </w:r>
       <w:r>
         <w:rPr>
+          <w:rFonts w:cstheme="minorHAnsi"/>
           <w:lang w:val="en-IN"/>
         </w:rPr>
         <w:t>completed with all deliverables uploaded</w:t>
       </w:r>
       <w:r>
         <w:rPr>
+          <w:rFonts w:cstheme="minorHAnsi"/>
           <w:lang w:val="en-IN"/>
         </w:rPr>
         <w:br/>
@@ -2360,21 +3978,15 @@
     <w:p>
       <w:pPr>
         <w:rPr>
-          <w:lang w:val="en-IN"/>
-        </w:rPr>
-      </w:pPr>
-      <w:r>
-        <w:rPr>
-          <w:lang w:val="en-IN"/>
-        </w:rPr>
-        <w:pict w14:anchorId="085FB5DA">
-          <v:rect id="_x0000_i1044" style="width:0;height:1.5pt" o:hralign="center" o:hrstd="t" o:hr="t" fillcolor="#a0a0a0" stroked="f"/>
-        </w:pict>
-      </w:r>
-    </w:p>
-    <w:p>
-      <w:pPr>
-        <w:rPr>
+          <w:rFonts w:cstheme="minorHAnsi"/>
+          <w:lang w:val="en-IN"/>
+        </w:rPr>
+      </w:pPr>
+    </w:p>
+    <w:p>
+      <w:pPr>
+        <w:rPr>
+          <w:rFonts w:cstheme="minorHAnsi"/>
           <w:b/>
           <w:bCs/>
           <w:sz w:val="28"/>
@@ -2386,6 +3998,7 @@
     <w:p>
       <w:pPr>
         <w:rPr>
+          <w:rFonts w:cstheme="minorHAnsi"/>
           <w:b/>
           <w:bCs/>
           <w:sz w:val="28"/>
@@ -2395,6 +4008,7 @@
       </w:pPr>
       <w:r>
         <w:rPr>
+          <w:rFonts w:cstheme="minorHAnsi"/>
           <w:b/>
           <w:bCs/>
           <w:sz w:val="28"/>
@@ -2412,11 +4026,13 @@
           <w:numId w:val="4"/>
         </w:numPr>
         <w:rPr>
-          <w:lang w:val="en-IN"/>
-        </w:rPr>
-      </w:pPr>
-      <w:r>
-        <w:rPr>
+          <w:rFonts w:cstheme="minorHAnsi"/>
+          <w:lang w:val="en-IN"/>
+        </w:rPr>
+      </w:pPr>
+      <w:r>
+        <w:rPr>
+          <w:rFonts w:cstheme="minorHAnsi"/>
           <w:lang w:val="en-IN"/>
         </w:rPr>
         <w:t xml:space="preserve">User profile customization </w:t>
@@ -2429,11 +4045,13 @@
           <w:numId w:val="4"/>
         </w:numPr>
         <w:rPr>
-          <w:lang w:val="en-IN"/>
-        </w:rPr>
-      </w:pPr>
-      <w:r>
-        <w:rPr>
+          <w:rFonts w:cstheme="minorHAnsi"/>
+          <w:lang w:val="en-IN"/>
+        </w:rPr>
+      </w:pPr>
+      <w:r>
+        <w:rPr>
+          <w:rFonts w:cstheme="minorHAnsi"/>
           <w:lang w:val="en-IN"/>
         </w:rPr>
         <w:t xml:space="preserve">Saved or bookmarked posts </w:t>
@@ -2446,11 +4064,13 @@
           <w:numId w:val="4"/>
         </w:numPr>
         <w:rPr>
-          <w:lang w:val="en-IN"/>
-        </w:rPr>
-      </w:pPr>
-      <w:r>
-        <w:rPr>
+          <w:rFonts w:cstheme="minorHAnsi"/>
+          <w:lang w:val="en-IN"/>
+        </w:rPr>
+      </w:pPr>
+      <w:r>
+        <w:rPr>
+          <w:rFonts w:cstheme="minorHAnsi"/>
           <w:lang w:val="en-IN"/>
         </w:rPr>
         <w:t xml:space="preserve">Voice-based AI chatbot </w:t>
@@ -2463,11 +4083,13 @@
           <w:numId w:val="4"/>
         </w:numPr>
         <w:rPr>
-          <w:lang w:val="en-IN"/>
-        </w:rPr>
-      </w:pPr>
-      <w:r>
-        <w:rPr>
+          <w:rFonts w:cstheme="minorHAnsi"/>
+          <w:lang w:val="en-IN"/>
+        </w:rPr>
+      </w:pPr>
+      <w:r>
+        <w:rPr>
+          <w:rFonts w:cstheme="minorHAnsi"/>
           <w:lang w:val="en-IN"/>
         </w:rPr>
         <w:t xml:space="preserve">Moderation and reporting system </w:t>
@@ -2480,11 +4102,13 @@
           <w:numId w:val="4"/>
         </w:numPr>
         <w:rPr>
-          <w:lang w:val="en-IN"/>
-        </w:rPr>
-      </w:pPr>
-      <w:r>
-        <w:rPr>
+          <w:rFonts w:cstheme="minorHAnsi"/>
+          <w:lang w:val="en-IN"/>
+        </w:rPr>
+      </w:pPr>
+      <w:r>
+        <w:rPr>
+          <w:rFonts w:cstheme="minorHAnsi"/>
           <w:lang w:val="en-IN"/>
         </w:rPr>
         <w:t xml:space="preserve">Notification system </w:t>
@@ -2493,11 +4117,13 @@
     <w:p>
       <w:pPr>
         <w:rPr>
-          <w:lang w:val="en-IN"/>
-        </w:rPr>
-      </w:pPr>
-      <w:r>
-        <w:rPr>
+          <w:rFonts w:cstheme="minorHAnsi"/>
+          <w:lang w:val="en-IN"/>
+        </w:rPr>
+      </w:pPr>
+      <w:r>
+        <w:rPr>
+          <w:rFonts w:cstheme="minorHAnsi"/>
           <w:lang w:val="en-IN"/>
         </w:rPr>
         <w:pict w14:anchorId="5AD0157B">
@@ -2508,6 +4134,7 @@
     <w:p>
       <w:pPr>
         <w:rPr>
+          <w:rFonts w:cstheme="minorHAnsi"/>
           <w:b/>
           <w:bCs/>
           <w:sz w:val="28"/>
@@ -2519,6 +4146,7 @@
     <w:p>
       <w:pPr>
         <w:rPr>
+          <w:rFonts w:cstheme="minorHAnsi"/>
           <w:b/>
           <w:bCs/>
           <w:sz w:val="28"/>
@@ -2528,24 +4156,38 @@
       </w:pPr>
       <w:r>
         <w:rPr>
+          <w:rFonts w:cstheme="minorHAnsi"/>
           <w:b/>
           <w:bCs/>
           <w:sz w:val="28"/>
           <w:szCs w:val="28"/>
           <w:lang w:val="en-IN"/>
         </w:rPr>
+        <w:t xml:space="preserve">10. </w:t>
+      </w:r>
+      <w:r>
+        <w:rPr>
+          <w:rFonts w:cstheme="minorHAnsi"/>
+          <w:b/>
+          <w:bCs/>
+          <w:sz w:val="28"/>
+          <w:szCs w:val="28"/>
+          <w:lang w:val="en-IN"/>
+        </w:rPr>
         <w:t>Conclusion</w:t>
       </w:r>
     </w:p>
     <w:p>
       <w:pPr>
         <w:rPr>
+          <w:rFonts w:cstheme="minorHAnsi"/>
           <w:lang w:val="en-IN"/>
         </w:rPr>
       </w:pPr>
       <w:proofErr w:type="spellStart"/>
       <w:r>
         <w:rPr>
+          <w:rFonts w:cstheme="minorHAnsi"/>
           <w:lang w:val="en-IN"/>
         </w:rPr>
         <w:t>HerCircle</w:t>
@@ -2553,12 +4195,19 @@
       <w:proofErr w:type="spellEnd"/>
       <w:r>
         <w:rPr>
+          <w:rFonts w:cstheme="minorHAnsi"/>
           <w:lang w:val="en-IN"/>
         </w:rPr>
         <w:t xml:space="preserve"> aims to create a safe, inclusive, and empowering digital space for women. By combining community-driven support with AI-powered assistance, the platform enhances accessibility, privacy, and overall well-being.</w:t>
       </w:r>
     </w:p>
-    <w:p/>
+    <w:p>
+      <w:pPr>
+        <w:rPr>
+          <w:rFonts w:cstheme="minorHAnsi"/>
+        </w:rPr>
+      </w:pPr>
+    </w:p>
     <w:sectPr>
       <w:pgSz w:w="12240" w:h="15840"/>
       <w:pgMar w:top="1440" w:right="1440" w:bottom="1440" w:left="1440" w:header="708" w:footer="708" w:gutter="0"/>
@@ -2571,6 +4220,11 @@
 
 <file path=word/numbering.xml><?xml version="1.0" encoding="utf-8"?>
 <w:numbering xmlns:wpc="http://schemas.microsoft.com/office/word/2010/wordprocessingCanvas" xmlns:cx="http://schemas.microsoft.com/office/drawing/2014/chartex" xmlns:cx1="http://schemas.microsoft.com/office/drawing/2015/9/8/chartex" xmlns:cx2="http://schemas.microsoft.com/office/drawing/2015/10/21/chartex" xmlns:cx3="http://schemas.microsoft.com/office/drawing/2016/5/9/chartex" xmlns:cx4="http://schemas.microsoft.com/office/drawing/2016/5/10/chartex" xmlns:cx5="http://schemas.microsoft.com/office/drawing/2016/5/11/chartex" xmlns:cx6="http://schemas.microsoft.com/office/drawing/2016/5/12/chartex" xmlns:cx7="http://schemas.microsoft.com/office/drawing/2016/5/13/chartex" xmlns:cx8="http://schemas.microsoft.com/office/drawing/2016/5/14/chartex" xmlns:mc="http://schemas.openxmlformats.org/markup-compatibility/2006" xmlns:aink="http://schemas.microsoft.com/office/drawing/2016/ink" xmlns:am3d="http://schemas.microsoft.com/office/drawing/2017/model3d" xmlns:o="urn:schemas-microsoft-com:office:office" xmlns:oel="http://schemas.microsoft.com/office/2019/extlst" xmlns:r="http://schemas.openxmlformats.org/officeDocument/2006/relationships" xmlns:m="http://schemas.openxmlformats.org/officeDocument/2006/math" xmlns:v="urn:schemas-microsoft-com:vml" xmlns:wp14="http://schemas.microsoft.com/office/word/2010/wordprocessingDrawing" xmlns:wp="http://schemas.openxmlformats.org/drawingml/2006/wordprocessingDrawing" xmlns:w10="urn:schemas-microsoft-com:office:word" xmlns:w="http://schemas.openxmlformats.org/wordprocessingml/2006/main" xmlns:w14="http://schemas.microsoft.com/office/word/2010/wordml" xmlns:w15="http://schemas.microsoft.com/office/word/2012/wordml" xmlns:w16cex="http://schemas.microsoft.com/office/word/2018/wordml/cex" xmlns:w16cid="http://schemas.microsoft.com/office/word/2016/wordml/cid" xmlns:w16="http://schemas.microsoft.com/office/word/2018/wordml" xmlns:w16du="http://schemas.microsoft.com/office/word/2023/wordml/word16du" xmlns:w16sdtdh="http://schemas.microsoft.com/office/word/2020/wordml/sdtdatahash" xmlns:w16sdtfl="http://schemas.microsoft.com/office/word/2024/wordml/sdtformatlock" xmlns:w16se="http://schemas.microsoft.com/office/word/2015/wordml/symex" xmlns:wpg="http://schemas.microsoft.com/office/word/2010/wordprocessingGroup" xmlns:wpi="http://schemas.microsoft.com/office/word/2010/wordprocessingInk" xmlns:wne="http://schemas.microsoft.com/office/word/2006/wordml" xmlns:wps="http://schemas.microsoft.com/office/word/2010/wordprocessingShape" mc:Ignorable="w14 w15 w16se w16cid w16 w16cex w16sdtdh w16sdtfl w16du wp14">
+  <w:numPicBullet w:numPicBulletId="0">
+    <w:pict>
+      <v:rect id="_x0000_i1025" style="width:0;height:1.5pt" o:hralign="center" o:bullet="t" o:hrstd="t" o:hr="t" fillcolor="#a0a0a0" stroked="f"/>
+    </w:pict>
+  </w:numPicBullet>
   <w:abstractNum w:abstractNumId="0" w15:restartNumberingAfterBreak="0">
     <w:nsid w:val="16254848"/>
     <w:multiLevelType w:val="multilevel"/>
@@ -4713,7 +6367,6 @@
   <w:style w:type="character" w:default="1" w:styleId="DefaultParagraphFont">
     <w:name w:val="Default Paragraph Font"/>
     <w:uiPriority w:val="1"/>
-    <w:semiHidden/>
     <w:unhideWhenUsed/>
   </w:style>
   <w:style w:type="table" w:default="1" w:styleId="TableNormal">
@@ -5028,6 +6681,29 @@
       <w:spacing w:val="5"/>
     </w:rPr>
   </w:style>
+  <w:style w:type="table" w:styleId="TableGrid">
+    <w:name w:val="Table Grid"/>
+    <w:basedOn w:val="TableNormal"/>
+    <w:uiPriority w:val="59"/>
+    <w:rsid w:val="002021C2"/>
+    <w:pPr>
+      <w:spacing w:after="0" w:line="240" w:lineRule="auto"/>
+    </w:pPr>
+    <w:rPr>
+      <w:rFonts w:eastAsiaTheme="minorEastAsia"/>
+      <w:kern w:val="0"/>
+    </w:rPr>
+    <w:tblPr>
+      <w:tblBorders>
+        <w:top w:val="single" w:sz="4" w:space="0" w:color="auto"/>
+        <w:left w:val="single" w:sz="4" w:space="0" w:color="auto"/>
+        <w:bottom w:val="single" w:sz="4" w:space="0" w:color="auto"/>
+        <w:right w:val="single" w:sz="4" w:space="0" w:color="auto"/>
+        <w:insideH w:val="single" w:sz="4" w:space="0" w:color="auto"/>
+        <w:insideV w:val="single" w:sz="4" w:space="0" w:color="auto"/>
+      </w:tblBorders>
+    </w:tblPr>
+  </w:style>
 </w:styles>
 </file>
 

</xml_diff>